<commit_message>
docs: actualiza ERS y testing con enfoque ejecutivo
</commit_message>
<xml_diff>
--- a/docs/entrega/Cobertura_Testing_KYNEX.docx
+++ b/docs/entrega/Cobertura_Testing_KYNEX.docx
@@ -7,19 +7,19 @@
         <w:pStyle w:val="Title"/>
       </w:pPr>
       <w:r>
-        <w:t>Cobertura de testing de KYNEX</w:t>
+        <w:t>Cobertura del testing</w:t>
       </w:r>
     </w:p>
     <w:p>
+      <w:pPr>
+        <w:widowControl/>
+      </w:pPr>
       <w:r>
-        <w:t>Evaluación Parcial 2 de DSY1104 · Full Stack 2</w:t>
+        <w:t>KYNEX · Informe ejecutivo de calidad</w:t>
         <w:br/>
-        <w:t>Alexander Llantén Sepúlveda · 26 de octubre de 2026</w:t>
-      </w:r>
-    </w:p>
-    <w:p>
-      <w:r>
-        <w:t>La migración Front End aprobó 597 pruebas en 80 archivos, sin fallos ni omisiones, en un clon nuevo del repositorio público. Este informe documenta el proceso, diez casos representativos, la cobertura de código y las comprobaciones de navegador que acompañan la entrega.</w:t>
+        <w:t>Versión 2 · 26 de octubre de 2026</w:t>
+        <w:br/>
+        <w:t>Alexander Llantén Sepúlveda · Full Stack 2</w:t>
       </w:r>
     </w:p>
     <w:p>
@@ -27,7 +27,39 @@
         <w:pStyle w:val="Heading1"/>
       </w:pPr>
       <w:r>
-        <w:t>Resultado del corte</w:t>
+        <w:t>Resumen ejecutivo</w:t>
+      </w:r>
+    </w:p>
+    <w:p>
+      <w:pPr>
+        <w:widowControl/>
+      </w:pPr>
+      <w:r>
+        <w:t>La versión evaluada de KYNEX aprobó las 597 pruebas automatizadas, sin fallos ni omisiones. La ejecución incluye la corrección que permite visualizar fotografías en el carrito y conserva los comportamientos de compra, usuarios, administración, contenido y entrenamiento.</w:t>
+      </w:r>
+    </w:p>
+    <w:p>
+      <w:pPr>
+        <w:widowControl/>
+      </w:pPr>
+      <w:r>
+        <w:t>El resultado respalda el funcionamiento de los escenarios comprobados. La cobertura identifica el código ejecutado durante las pruebas y permite priorizar verificaciones adicionales; no representa un porcentaje de requisitos cumplidos ni garantiza la ausencia de defectos.</w:t>
+      </w:r>
+    </w:p>
+    <w:p>
+      <w:pPr>
+        <w:widowControl/>
+      </w:pPr>
+      <w:r>
+        <w:t>La suite reúne 80 agrupaciones de prueba. La compilación de producción se completó correctamente.</w:t>
+      </w:r>
+    </w:p>
+    <w:p>
+      <w:pPr>
+        <w:pStyle w:val="Heading1"/>
+      </w:pPr>
+      <w:r>
+        <w:t>Cobertura de código</w:t>
       </w:r>
     </w:p>
     <w:tbl>
@@ -45,8 +77,9 @@
         </w:tblBorders>
       </w:tblPr>
       <w:tblGrid>
-        <w:gridCol w:w="3312"/>
-        <w:gridCol w:w="6480"/>
+        <w:gridCol w:w="3888"/>
+        <w:gridCol w:w="3456"/>
+        <w:gridCol w:w="2736"/>
       </w:tblGrid>
       <w:tr>
         <w:trPr>
@@ -55,51 +88,82 @@
         </w:trPr>
         <w:tc>
           <w:tcPr>
-            <w:tcW w:type="dxa" w:w="3312"/>
+            <w:tcW w:type="dxa" w:w="3888"/>
+            <w:vAlign w:val="center"/>
             <w:shd w:fill="333333"/>
             <w:tcMar>
-              <w:top w:w="90" w:type="dxa"/>
-              <w:bottom w:w="90" w:type="dxa"/>
-              <w:left w:w="90" w:type="dxa"/>
-              <w:right w:w="90" w:type="dxa"/>
+              <w:top w:w="95" w:type="dxa"/>
+              <w:bottom w:w="95" w:type="dxa"/>
+              <w:left w:w="95" w:type="dxa"/>
+              <w:right w:w="95" w:type="dxa"/>
             </w:tcMar>
           </w:tcPr>
           <w:p>
             <w:pPr>
-              <w:spacing w:after="40" w:before="40"/>
+              <w:spacing w:before="40" w:after="40" w:line="245" w:lineRule="auto"/>
+              <w:jc w:val="left"/>
             </w:pPr>
             <w:r>
               <w:rPr>
                 <w:b/>
                 <w:color w:val="FFFFFF"/>
-                <w:sz w:val="20"/>
+                <w:sz w:val="21"/>
               </w:rPr>
-              <w:t>Comprobación</w:t>
+              <w:t>Métrica</w:t>
             </w:r>
           </w:p>
         </w:tc>
         <w:tc>
           <w:tcPr>
-            <w:tcW w:type="dxa" w:w="6480"/>
+            <w:tcW w:type="dxa" w:w="3456"/>
+            <w:vAlign w:val="center"/>
             <w:shd w:fill="333333"/>
             <w:tcMar>
-              <w:top w:w="90" w:type="dxa"/>
-              <w:bottom w:w="90" w:type="dxa"/>
-              <w:left w:w="90" w:type="dxa"/>
-              <w:right w:w="90" w:type="dxa"/>
+              <w:top w:w="95" w:type="dxa"/>
+              <w:bottom w:w="95" w:type="dxa"/>
+              <w:left w:w="95" w:type="dxa"/>
+              <w:right w:w="95" w:type="dxa"/>
             </w:tcMar>
           </w:tcPr>
           <w:p>
             <w:pPr>
-              <w:spacing w:after="40" w:before="40"/>
+              <w:spacing w:before="40" w:after="40" w:line="245" w:lineRule="auto"/>
+              <w:jc w:val="center"/>
             </w:pPr>
             <w:r>
               <w:rPr>
                 <w:b/>
                 <w:color w:val="FFFFFF"/>
-                <w:sz w:val="20"/>
+                <w:sz w:val="21"/>
               </w:rPr>
-              <w:t>Resultado</w:t>
+              <w:t>Elementos cubiertos</w:t>
+            </w:r>
+          </w:p>
+        </w:tc>
+        <w:tc>
+          <w:tcPr>
+            <w:tcW w:type="dxa" w:w="2736"/>
+            <w:vAlign w:val="center"/>
+            <w:shd w:fill="333333"/>
+            <w:tcMar>
+              <w:top w:w="95" w:type="dxa"/>
+              <w:bottom w:w="95" w:type="dxa"/>
+              <w:left w:w="95" w:type="dxa"/>
+              <w:right w:w="95" w:type="dxa"/>
+            </w:tcMar>
+          </w:tcPr>
+          <w:p>
+            <w:pPr>
+              <w:spacing w:before="40" w:after="40" w:line="245" w:lineRule="auto"/>
+              <w:jc w:val="center"/>
+            </w:pPr>
+            <w:r>
+              <w:rPr>
+                <w:b/>
+                <w:color w:val="FFFFFF"/>
+                <w:sz w:val="21"/>
+              </w:rPr>
+              <w:t>Cobertura</w:t>
             </w:r>
           </w:p>
         </w:tc>
@@ -110,51 +174,82 @@
         </w:trPr>
         <w:tc>
           <w:tcPr>
-            <w:tcW w:type="dxa" w:w="3312"/>
+            <w:tcW w:type="dxa" w:w="3888"/>
+            <w:vAlign w:val="center"/>
             <w:shd w:fill="FFFFFF"/>
             <w:tcMar>
-              <w:top w:w="90" w:type="dxa"/>
-              <w:bottom w:w="90" w:type="dxa"/>
-              <w:left w:w="90" w:type="dxa"/>
-              <w:right w:w="90" w:type="dxa"/>
+              <w:top w:w="95" w:type="dxa"/>
+              <w:bottom w:w="95" w:type="dxa"/>
+              <w:left w:w="95" w:type="dxa"/>
+              <w:right w:w="95" w:type="dxa"/>
             </w:tcMar>
           </w:tcPr>
           <w:p>
             <w:pPr>
-              <w:spacing w:after="40" w:before="40"/>
+              <w:spacing w:before="40" w:after="40" w:line="245" w:lineRule="auto"/>
+              <w:jc w:val="left"/>
             </w:pPr>
             <w:r>
               <w:rPr>
                 <w:b w:val="0"/>
                 <w:color w:val="000000"/>
-                <w:sz w:val="20"/>
+                <w:sz w:val="21"/>
               </w:rPr>
-              <w:t>Instalación reproducible</w:t>
+              <w:t>Sentencias</w:t>
             </w:r>
           </w:p>
         </w:tc>
         <w:tc>
           <w:tcPr>
-            <w:tcW w:type="dxa" w:w="6480"/>
+            <w:tcW w:type="dxa" w:w="3456"/>
+            <w:vAlign w:val="center"/>
             <w:shd w:fill="FFFFFF"/>
             <w:tcMar>
-              <w:top w:w="90" w:type="dxa"/>
-              <w:bottom w:w="90" w:type="dxa"/>
-              <w:left w:w="90" w:type="dxa"/>
-              <w:right w:w="90" w:type="dxa"/>
+              <w:top w:w="95" w:type="dxa"/>
+              <w:bottom w:w="95" w:type="dxa"/>
+              <w:left w:w="95" w:type="dxa"/>
+              <w:right w:w="95" w:type="dxa"/>
             </w:tcMar>
           </w:tcPr>
           <w:p>
             <w:pPr>
-              <w:spacing w:after="40" w:before="40"/>
+              <w:spacing w:before="40" w:after="40" w:line="245" w:lineRule="auto"/>
+              <w:jc w:val="center"/>
             </w:pPr>
             <w:r>
               <w:rPr>
                 <w:b w:val="0"/>
                 <w:color w:val="000000"/>
-                <w:sz w:val="20"/>
+                <w:sz w:val="21"/>
               </w:rPr>
-              <w:t>npm ci correcto en un clon limpio</w:t>
+              <w:t>1314 de 1342</w:t>
+            </w:r>
+          </w:p>
+        </w:tc>
+        <w:tc>
+          <w:tcPr>
+            <w:tcW w:type="dxa" w:w="2736"/>
+            <w:vAlign w:val="center"/>
+            <w:shd w:fill="FFFFFF"/>
+            <w:tcMar>
+              <w:top w:w="95" w:type="dxa"/>
+              <w:bottom w:w="95" w:type="dxa"/>
+              <w:left w:w="95" w:type="dxa"/>
+              <w:right w:w="95" w:type="dxa"/>
+            </w:tcMar>
+          </w:tcPr>
+          <w:p>
+            <w:pPr>
+              <w:spacing w:before="40" w:after="40" w:line="245" w:lineRule="auto"/>
+              <w:jc w:val="center"/>
+            </w:pPr>
+            <w:r>
+              <w:rPr>
+                <w:b w:val="0"/>
+                <w:color w:val="000000"/>
+                <w:sz w:val="21"/>
+              </w:rPr>
+              <w:t>97,91%</w:t>
             </w:r>
           </w:p>
         </w:tc>
@@ -165,51 +260,82 @@
         </w:trPr>
         <w:tc>
           <w:tcPr>
-            <w:tcW w:type="dxa" w:w="3312"/>
-            <w:shd w:fill="F2F2F2"/>
+            <w:tcW w:type="dxa" w:w="3888"/>
+            <w:vAlign w:val="center"/>
+            <w:shd w:fill="F3F3F3"/>
             <w:tcMar>
-              <w:top w:w="90" w:type="dxa"/>
-              <w:bottom w:w="90" w:type="dxa"/>
-              <w:left w:w="90" w:type="dxa"/>
-              <w:right w:w="90" w:type="dxa"/>
+              <w:top w:w="95" w:type="dxa"/>
+              <w:bottom w:w="95" w:type="dxa"/>
+              <w:left w:w="95" w:type="dxa"/>
+              <w:right w:w="95" w:type="dxa"/>
             </w:tcMar>
           </w:tcPr>
           <w:p>
             <w:pPr>
-              <w:spacing w:after="40" w:before="40"/>
+              <w:spacing w:before="40" w:after="40" w:line="245" w:lineRule="auto"/>
+              <w:jc w:val="left"/>
             </w:pPr>
             <w:r>
               <w:rPr>
                 <w:b w:val="0"/>
                 <w:color w:val="000000"/>
-                <w:sz w:val="20"/>
+                <w:sz w:val="21"/>
               </w:rPr>
-              <w:t>Pruebas automatizadas</w:t>
+              <w:t>Ramas de decisión</w:t>
             </w:r>
           </w:p>
         </w:tc>
         <w:tc>
           <w:tcPr>
-            <w:tcW w:type="dxa" w:w="6480"/>
-            <w:shd w:fill="F2F2F2"/>
+            <w:tcW w:type="dxa" w:w="3456"/>
+            <w:vAlign w:val="center"/>
+            <w:shd w:fill="F3F3F3"/>
             <w:tcMar>
-              <w:top w:w="90" w:type="dxa"/>
-              <w:bottom w:w="90" w:type="dxa"/>
-              <w:left w:w="90" w:type="dxa"/>
-              <w:right w:w="90" w:type="dxa"/>
+              <w:top w:w="95" w:type="dxa"/>
+              <w:bottom w:w="95" w:type="dxa"/>
+              <w:left w:w="95" w:type="dxa"/>
+              <w:right w:w="95" w:type="dxa"/>
             </w:tcMar>
           </w:tcPr>
           <w:p>
             <w:pPr>
-              <w:spacing w:after="40" w:before="40"/>
+              <w:spacing w:before="40" w:after="40" w:line="245" w:lineRule="auto"/>
+              <w:jc w:val="center"/>
             </w:pPr>
             <w:r>
               <w:rPr>
                 <w:b w:val="0"/>
                 <w:color w:val="000000"/>
-                <w:sz w:val="20"/>
+                <w:sz w:val="21"/>
               </w:rPr>
-              <w:t>597 aprobadas · 0 fallidas · 0 omitidas</w:t>
+              <w:t>1046 de 1104</w:t>
+            </w:r>
+          </w:p>
+        </w:tc>
+        <w:tc>
+          <w:tcPr>
+            <w:tcW w:type="dxa" w:w="2736"/>
+            <w:vAlign w:val="center"/>
+            <w:shd w:fill="F3F3F3"/>
+            <w:tcMar>
+              <w:top w:w="95" w:type="dxa"/>
+              <w:bottom w:w="95" w:type="dxa"/>
+              <w:left w:w="95" w:type="dxa"/>
+              <w:right w:w="95" w:type="dxa"/>
+            </w:tcMar>
+          </w:tcPr>
+          <w:p>
+            <w:pPr>
+              <w:spacing w:before="40" w:after="40" w:line="245" w:lineRule="auto"/>
+              <w:jc w:val="center"/>
+            </w:pPr>
+            <w:r>
+              <w:rPr>
+                <w:b w:val="0"/>
+                <w:color w:val="000000"/>
+                <w:sz w:val="21"/>
+              </w:rPr>
+              <w:t>94,74%</w:t>
             </w:r>
           </w:p>
         </w:tc>
@@ -220,51 +346,82 @@
         </w:trPr>
         <w:tc>
           <w:tcPr>
-            <w:tcW w:type="dxa" w:w="3312"/>
+            <w:tcW w:type="dxa" w:w="3888"/>
+            <w:vAlign w:val="center"/>
             <w:shd w:fill="FFFFFF"/>
             <w:tcMar>
-              <w:top w:w="90" w:type="dxa"/>
-              <w:bottom w:w="90" w:type="dxa"/>
-              <w:left w:w="90" w:type="dxa"/>
-              <w:right w:w="90" w:type="dxa"/>
+              <w:top w:w="95" w:type="dxa"/>
+              <w:bottom w:w="95" w:type="dxa"/>
+              <w:left w:w="95" w:type="dxa"/>
+              <w:right w:w="95" w:type="dxa"/>
             </w:tcMar>
           </w:tcPr>
           <w:p>
             <w:pPr>
-              <w:spacing w:after="40" w:before="40"/>
+              <w:spacing w:before="40" w:after="40" w:line="245" w:lineRule="auto"/>
+              <w:jc w:val="left"/>
             </w:pPr>
             <w:r>
               <w:rPr>
                 <w:b w:val="0"/>
                 <w:color w:val="000000"/>
-                <w:sz w:val="20"/>
+                <w:sz w:val="21"/>
               </w:rPr>
-              <w:t>Archivos y duración</w:t>
+              <w:t>Funciones</w:t>
             </w:r>
           </w:p>
         </w:tc>
         <w:tc>
           <w:tcPr>
-            <w:tcW w:type="dxa" w:w="6480"/>
+            <w:tcW w:type="dxa" w:w="3456"/>
+            <w:vAlign w:val="center"/>
             <w:shd w:fill="FFFFFF"/>
             <w:tcMar>
-              <w:top w:w="90" w:type="dxa"/>
-              <w:bottom w:w="90" w:type="dxa"/>
-              <w:left w:w="90" w:type="dxa"/>
-              <w:right w:w="90" w:type="dxa"/>
+              <w:top w:w="95" w:type="dxa"/>
+              <w:bottom w:w="95" w:type="dxa"/>
+              <w:left w:w="95" w:type="dxa"/>
+              <w:right w:w="95" w:type="dxa"/>
             </w:tcMar>
           </w:tcPr>
           <w:p>
             <w:pPr>
-              <w:spacing w:after="40" w:before="40"/>
+              <w:spacing w:before="40" w:after="40" w:line="245" w:lineRule="auto"/>
+              <w:jc w:val="center"/>
             </w:pPr>
             <w:r>
               <w:rPr>
                 <w:b w:val="0"/>
                 <w:color w:val="000000"/>
-                <w:sz w:val="20"/>
+                <w:sz w:val="21"/>
               </w:rPr>
-              <w:t>80 archivos · 150,02 segundos</w:t>
+              <w:t>431 de 434</w:t>
+            </w:r>
+          </w:p>
+        </w:tc>
+        <w:tc>
+          <w:tcPr>
+            <w:tcW w:type="dxa" w:w="2736"/>
+            <w:vAlign w:val="center"/>
+            <w:shd w:fill="FFFFFF"/>
+            <w:tcMar>
+              <w:top w:w="95" w:type="dxa"/>
+              <w:bottom w:w="95" w:type="dxa"/>
+              <w:left w:w="95" w:type="dxa"/>
+              <w:right w:w="95" w:type="dxa"/>
+            </w:tcMar>
+          </w:tcPr>
+          <w:p>
+            <w:pPr>
+              <w:spacing w:before="40" w:after="40" w:line="245" w:lineRule="auto"/>
+              <w:jc w:val="center"/>
+            </w:pPr>
+            <w:r>
+              <w:rPr>
+                <w:b w:val="0"/>
+                <w:color w:val="000000"/>
+                <w:sz w:val="21"/>
+              </w:rPr>
+              <w:t>99,30%</w:t>
             </w:r>
           </w:p>
         </w:tc>
@@ -275,106 +432,82 @@
         </w:trPr>
         <w:tc>
           <w:tcPr>
-            <w:tcW w:type="dxa" w:w="3312"/>
-            <w:shd w:fill="F2F2F2"/>
+            <w:tcW w:type="dxa" w:w="3888"/>
+            <w:vAlign w:val="center"/>
+            <w:shd w:fill="F3F3F3"/>
             <w:tcMar>
-              <w:top w:w="90" w:type="dxa"/>
-              <w:bottom w:w="90" w:type="dxa"/>
-              <w:left w:w="90" w:type="dxa"/>
-              <w:right w:w="90" w:type="dxa"/>
+              <w:top w:w="95" w:type="dxa"/>
+              <w:bottom w:w="95" w:type="dxa"/>
+              <w:left w:w="95" w:type="dxa"/>
+              <w:right w:w="95" w:type="dxa"/>
             </w:tcMar>
           </w:tcPr>
           <w:p>
             <w:pPr>
-              <w:spacing w:after="40" w:before="40"/>
+              <w:spacing w:before="40" w:after="40" w:line="245" w:lineRule="auto"/>
+              <w:jc w:val="left"/>
             </w:pPr>
             <w:r>
               <w:rPr>
                 <w:b w:val="0"/>
                 <w:color w:val="000000"/>
-                <w:sz w:val="20"/>
+                <w:sz w:val="21"/>
               </w:rPr>
-              <w:t>Producción</w:t>
+              <w:t>Líneas</w:t>
             </w:r>
           </w:p>
         </w:tc>
         <w:tc>
           <w:tcPr>
-            <w:tcW w:type="dxa" w:w="6480"/>
-            <w:shd w:fill="F2F2F2"/>
+            <w:tcW w:type="dxa" w:w="3456"/>
+            <w:vAlign w:val="center"/>
+            <w:shd w:fill="F3F3F3"/>
             <w:tcMar>
-              <w:top w:w="90" w:type="dxa"/>
-              <w:bottom w:w="90" w:type="dxa"/>
-              <w:left w:w="90" w:type="dxa"/>
-              <w:right w:w="90" w:type="dxa"/>
+              <w:top w:w="95" w:type="dxa"/>
+              <w:bottom w:w="95" w:type="dxa"/>
+              <w:left w:w="95" w:type="dxa"/>
+              <w:right w:w="95" w:type="dxa"/>
             </w:tcMar>
           </w:tcPr>
           <w:p>
             <w:pPr>
-              <w:spacing w:after="40" w:before="40"/>
+              <w:spacing w:before="40" w:after="40" w:line="245" w:lineRule="auto"/>
+              <w:jc w:val="center"/>
             </w:pPr>
             <w:r>
               <w:rPr>
                 <w:b w:val="0"/>
                 <w:color w:val="000000"/>
-                <w:sz w:val="20"/>
+                <w:sz w:val="21"/>
               </w:rPr>
-              <w:t>npm run build correcto</w:t>
+              <w:t>1077 de 1088</w:t>
             </w:r>
           </w:p>
         </w:tc>
-      </w:tr>
-      <w:tr>
-        <w:trPr>
-          <w:cantSplit/>
-        </w:trPr>
         <w:tc>
           <w:tcPr>
-            <w:tcW w:type="dxa" w:w="3312"/>
-            <w:shd w:fill="FFFFFF"/>
+            <w:tcW w:type="dxa" w:w="2736"/>
+            <w:vAlign w:val="center"/>
+            <w:shd w:fill="F3F3F3"/>
             <w:tcMar>
-              <w:top w:w="90" w:type="dxa"/>
-              <w:bottom w:w="90" w:type="dxa"/>
-              <w:left w:w="90" w:type="dxa"/>
-              <w:right w:w="90" w:type="dxa"/>
+              <w:top w:w="95" w:type="dxa"/>
+              <w:bottom w:w="95" w:type="dxa"/>
+              <w:left w:w="95" w:type="dxa"/>
+              <w:right w:w="95" w:type="dxa"/>
             </w:tcMar>
           </w:tcPr>
           <w:p>
             <w:pPr>
-              <w:spacing w:after="40" w:before="40"/>
+              <w:spacing w:before="40" w:after="40" w:line="245" w:lineRule="auto"/>
+              <w:jc w:val="center"/>
             </w:pPr>
             <w:r>
               <w:rPr>
                 <w:b w:val="0"/>
                 <w:color w:val="000000"/>
-                <w:sz w:val="20"/>
+                <w:sz w:val="21"/>
               </w:rPr>
-              <w:t>Navegador</w:t>
-            </w:r>
-          </w:p>
-        </w:tc>
-        <w:tc>
-          <w:tcPr>
-            <w:tcW w:type="dxa" w:w="6480"/>
-            <w:shd w:fill="FFFFFF"/>
-            <w:tcMar>
-              <w:top w:w="90" w:type="dxa"/>
-              <w:bottom w:w="90" w:type="dxa"/>
-              <w:left w:w="90" w:type="dxa"/>
-              <w:right w:w="90" w:type="dxa"/>
-            </w:tcMar>
-          </w:tcPr>
-          <w:p>
-            <w:pPr>
-              <w:spacing w:after="40" w:before="40"/>
-            </w:pPr>
-            <w:r>
-              <w:rPr>
-                <w:b w:val="0"/>
-                <w:color w:val="000000"/>
-                <w:sz w:val="20"/>
-              </w:rPr>
-              <w:t>66 revisiones de rutas y tamaños; alcance detallado en la auditoría</w:t>
+              <w:t>98,98%</w:t>
             </w:r>
           </w:p>
         </w:tc>
@@ -382,10 +515,53 @@
     </w:tbl>
     <w:p>
       <w:pPr>
+        <w:spacing w:after="40" w:before="0" w:line="40" w:lineRule="exact"/>
+      </w:pPr>
+      <w:r>
+        <w:rPr>
+          <w:sz w:val="4"/>
+        </w:rPr>
+      </w:r>
+    </w:p>
+    <w:p>
+      <w:pPr>
+        <w:widowControl/>
+      </w:pPr>
+      <w:r>
+        <w:t>Las líneas indican instrucciones alcanzadas; las ramas distinguen alternativas de decisión. El análisis conjunto evita interpretar una cobertura alta de líneas como verificación completa de todos los comportamientos posibles.</w:t>
+      </w:r>
+    </w:p>
+    <w:p>
+      <w:pPr>
         <w:pStyle w:val="Heading1"/>
       </w:pPr>
       <w:r>
-        <w:t>Cobertura medida</w:t>
+        <w:t>Entorno de evaluación</w:t>
+      </w:r>
+    </w:p>
+    <w:p>
+      <w:pPr>
+        <w:widowControl/>
+      </w:pPr>
+      <w:r>
+        <w:t>La ejecución utilizó Windows, Node.js 24.22.1, npm 11.19.1, Vitest 5.0.5 y jsdom 30.1.3. React Testing Library y userEvent permitieron comprobar el contenido visible y las interacciones. La medición se realizó con el proveedor V8.</w:t>
+      </w:r>
+    </w:p>
+    <w:p>
+      <w:pPr>
+        <w:pStyle w:val="Heading1"/>
+        <w:pageBreakBefore/>
+      </w:pPr>
+      <w:r>
+        <w:t>Alcance y metodología</w:t>
+      </w:r>
+    </w:p>
+    <w:p>
+      <w:pPr>
+        <w:widowControl/>
+      </w:pPr>
+      <w:r>
+        <w:t>La estrategia combina pruebas unitarias de componentes y reglas de negocio con pruebas de integración de navegación, proveedores de estado y servicios. Los casos verifican datos válidos e inválidos, eventos, permisos, persistencia, sincronización y recuperación ante errores.</w:t>
       </w:r>
     </w:p>
     <w:tbl>
@@ -403,9 +579,8 @@
         </w:tblBorders>
       </w:tblPr>
       <w:tblGrid>
-        <w:gridCol w:w="3312"/>
-        <w:gridCol w:w="3744"/>
-        <w:gridCol w:w="2736"/>
+        <w:gridCol w:w="7920"/>
+        <w:gridCol w:w="2160"/>
       </w:tblGrid>
       <w:tr>
         <w:trPr>
@@ -414,76 +589,55 @@
         </w:trPr>
         <w:tc>
           <w:tcPr>
-            <w:tcW w:type="dxa" w:w="3312"/>
+            <w:tcW w:type="dxa" w:w="7920"/>
+            <w:vAlign w:val="center"/>
             <w:shd w:fill="333333"/>
             <w:tcMar>
-              <w:top w:w="90" w:type="dxa"/>
-              <w:bottom w:w="90" w:type="dxa"/>
-              <w:left w:w="90" w:type="dxa"/>
-              <w:right w:w="90" w:type="dxa"/>
+              <w:top w:w="95" w:type="dxa"/>
+              <w:bottom w:w="95" w:type="dxa"/>
+              <w:left w:w="95" w:type="dxa"/>
+              <w:right w:w="95" w:type="dxa"/>
             </w:tcMar>
           </w:tcPr>
           <w:p>
             <w:pPr>
-              <w:spacing w:after="40" w:before="40"/>
+              <w:spacing w:before="40" w:after="40" w:line="245" w:lineRule="auto"/>
+              <w:jc w:val="left"/>
             </w:pPr>
             <w:r>
               <w:rPr>
                 <w:b/>
                 <w:color w:val="FFFFFF"/>
-                <w:sz w:val="20"/>
+                <w:sz w:val="21"/>
               </w:rPr>
-              <w:t>Métrica</w:t>
+              <w:t>Área de verificación</w:t>
             </w:r>
           </w:p>
         </w:tc>
         <w:tc>
           <w:tcPr>
-            <w:tcW w:type="dxa" w:w="3744"/>
+            <w:tcW w:type="dxa" w:w="2160"/>
+            <w:vAlign w:val="center"/>
             <w:shd w:fill="333333"/>
             <w:tcMar>
-              <w:top w:w="90" w:type="dxa"/>
-              <w:bottom w:w="90" w:type="dxa"/>
-              <w:left w:w="90" w:type="dxa"/>
-              <w:right w:w="90" w:type="dxa"/>
+              <w:top w:w="95" w:type="dxa"/>
+              <w:bottom w:w="95" w:type="dxa"/>
+              <w:left w:w="95" w:type="dxa"/>
+              <w:right w:w="95" w:type="dxa"/>
             </w:tcMar>
           </w:tcPr>
           <w:p>
             <w:pPr>
-              <w:spacing w:after="40" w:before="40"/>
+              <w:spacing w:before="40" w:after="40" w:line="245" w:lineRule="auto"/>
+              <w:jc w:val="center"/>
             </w:pPr>
             <w:r>
               <w:rPr>
                 <w:b/>
                 <w:color w:val="FFFFFF"/>
-                <w:sz w:val="20"/>
+                <w:sz w:val="21"/>
               </w:rPr>
-              <w:t>Cubierto sobre total</w:t>
-            </w:r>
-          </w:p>
-        </w:tc>
-        <w:tc>
-          <w:tcPr>
-            <w:tcW w:type="dxa" w:w="2736"/>
-            <w:shd w:fill="333333"/>
-            <w:tcMar>
-              <w:top w:w="90" w:type="dxa"/>
-              <w:bottom w:w="90" w:type="dxa"/>
-              <w:left w:w="90" w:type="dxa"/>
-              <w:right w:w="90" w:type="dxa"/>
-            </w:tcMar>
-          </w:tcPr>
-          <w:p>
-            <w:pPr>
-              <w:spacing w:after="40" w:before="40"/>
-            </w:pPr>
-            <w:r>
-              <w:rPr>
-                <w:b/>
-                <w:color w:val="FFFFFF"/>
-                <w:sz w:val="20"/>
-              </w:rPr>
-              <w:t>Porcentaje</w:t>
+              <w:t>Pruebas</w:t>
             </w:r>
           </w:p>
         </w:tc>
@@ -494,76 +648,55 @@
         </w:trPr>
         <w:tc>
           <w:tcPr>
-            <w:tcW w:type="dxa" w:w="3312"/>
+            <w:tcW w:type="dxa" w:w="7920"/>
+            <w:vAlign w:val="center"/>
             <w:shd w:fill="FFFFFF"/>
             <w:tcMar>
-              <w:top w:w="90" w:type="dxa"/>
-              <w:bottom w:w="90" w:type="dxa"/>
-              <w:left w:w="90" w:type="dxa"/>
-              <w:right w:w="90" w:type="dxa"/>
+              <w:top w:w="95" w:type="dxa"/>
+              <w:bottom w:w="95" w:type="dxa"/>
+              <w:left w:w="95" w:type="dxa"/>
+              <w:right w:w="95" w:type="dxa"/>
             </w:tcMar>
           </w:tcPr>
           <w:p>
             <w:pPr>
-              <w:spacing w:after="40" w:before="40"/>
+              <w:spacing w:before="40" w:after="40" w:line="245" w:lineRule="auto"/>
+              <w:jc w:val="left"/>
             </w:pPr>
             <w:r>
               <w:rPr>
                 <w:b w:val="0"/>
                 <w:color w:val="000000"/>
-                <w:sz w:val="20"/>
+                <w:sz w:val="21"/>
               </w:rPr>
-              <w:t>Sentencias</w:t>
+              <w:t>Componentes de interfaz y plantillas</w:t>
             </w:r>
           </w:p>
         </w:tc>
         <w:tc>
           <w:tcPr>
-            <w:tcW w:type="dxa" w:w="3744"/>
+            <w:tcW w:type="dxa" w:w="2160"/>
+            <w:vAlign w:val="center"/>
             <w:shd w:fill="FFFFFF"/>
             <w:tcMar>
-              <w:top w:w="90" w:type="dxa"/>
-              <w:bottom w:w="90" w:type="dxa"/>
-              <w:left w:w="90" w:type="dxa"/>
-              <w:right w:w="90" w:type="dxa"/>
+              <w:top w:w="95" w:type="dxa"/>
+              <w:bottom w:w="95" w:type="dxa"/>
+              <w:left w:w="95" w:type="dxa"/>
+              <w:right w:w="95" w:type="dxa"/>
             </w:tcMar>
           </w:tcPr>
           <w:p>
             <w:pPr>
-              <w:spacing w:after="40" w:before="40"/>
+              <w:spacing w:before="40" w:after="40" w:line="245" w:lineRule="auto"/>
+              <w:jc w:val="center"/>
             </w:pPr>
             <w:r>
               <w:rPr>
                 <w:b w:val="0"/>
                 <w:color w:val="000000"/>
-                <w:sz w:val="20"/>
+                <w:sz w:val="21"/>
               </w:rPr>
-              <w:t>1314 / 1342</w:t>
-            </w:r>
-          </w:p>
-        </w:tc>
-        <w:tc>
-          <w:tcPr>
-            <w:tcW w:type="dxa" w:w="2736"/>
-            <w:shd w:fill="FFFFFF"/>
-            <w:tcMar>
-              <w:top w:w="90" w:type="dxa"/>
-              <w:bottom w:w="90" w:type="dxa"/>
-              <w:left w:w="90" w:type="dxa"/>
-              <w:right w:w="90" w:type="dxa"/>
-            </w:tcMar>
-          </w:tcPr>
-          <w:p>
-            <w:pPr>
-              <w:spacing w:after="40" w:before="40"/>
-            </w:pPr>
-            <w:r>
-              <w:rPr>
-                <w:b w:val="0"/>
-                <w:color w:val="000000"/>
-                <w:sz w:val="20"/>
-              </w:rPr>
-              <w:t>97,91%</w:t>
+              <w:t>140</w:t>
             </w:r>
           </w:p>
         </w:tc>
@@ -574,76 +707,55 @@
         </w:trPr>
         <w:tc>
           <w:tcPr>
-            <w:tcW w:type="dxa" w:w="3312"/>
-            <w:shd w:fill="F2F2F2"/>
+            <w:tcW w:type="dxa" w:w="7920"/>
+            <w:vAlign w:val="center"/>
+            <w:shd w:fill="F3F3F3"/>
             <w:tcMar>
-              <w:top w:w="90" w:type="dxa"/>
-              <w:bottom w:w="90" w:type="dxa"/>
-              <w:left w:w="90" w:type="dxa"/>
-              <w:right w:w="90" w:type="dxa"/>
+              <w:top w:w="95" w:type="dxa"/>
+              <w:bottom w:w="95" w:type="dxa"/>
+              <w:left w:w="95" w:type="dxa"/>
+              <w:right w:w="95" w:type="dxa"/>
             </w:tcMar>
           </w:tcPr>
           <w:p>
             <w:pPr>
-              <w:spacing w:after="40" w:before="40"/>
+              <w:spacing w:before="40" w:after="40" w:line="245" w:lineRule="auto"/>
+              <w:jc w:val="left"/>
             </w:pPr>
             <w:r>
               <w:rPr>
                 <w:b w:val="0"/>
                 <w:color w:val="000000"/>
-                <w:sz w:val="20"/>
+                <w:sz w:val="21"/>
               </w:rPr>
-              <w:t>Ramas</w:t>
+              <w:t>Páginas</w:t>
             </w:r>
           </w:p>
         </w:tc>
         <w:tc>
           <w:tcPr>
-            <w:tcW w:type="dxa" w:w="3744"/>
-            <w:shd w:fill="F2F2F2"/>
+            <w:tcW w:type="dxa" w:w="2160"/>
+            <w:vAlign w:val="center"/>
+            <w:shd w:fill="F3F3F3"/>
             <w:tcMar>
-              <w:top w:w="90" w:type="dxa"/>
-              <w:bottom w:w="90" w:type="dxa"/>
-              <w:left w:w="90" w:type="dxa"/>
-              <w:right w:w="90" w:type="dxa"/>
+              <w:top w:w="95" w:type="dxa"/>
+              <w:bottom w:w="95" w:type="dxa"/>
+              <w:left w:w="95" w:type="dxa"/>
+              <w:right w:w="95" w:type="dxa"/>
             </w:tcMar>
           </w:tcPr>
           <w:p>
             <w:pPr>
-              <w:spacing w:after="40" w:before="40"/>
+              <w:spacing w:before="40" w:after="40" w:line="245" w:lineRule="auto"/>
+              <w:jc w:val="center"/>
             </w:pPr>
             <w:r>
               <w:rPr>
                 <w:b w:val="0"/>
                 <w:color w:val="000000"/>
-                <w:sz w:val="20"/>
+                <w:sz w:val="21"/>
               </w:rPr>
-              <w:t>1047 / 1106</w:t>
-            </w:r>
-          </w:p>
-        </w:tc>
-        <w:tc>
-          <w:tcPr>
-            <w:tcW w:type="dxa" w:w="2736"/>
-            <w:shd w:fill="F2F2F2"/>
-            <w:tcMar>
-              <w:top w:w="90" w:type="dxa"/>
-              <w:bottom w:w="90" w:type="dxa"/>
-              <w:left w:w="90" w:type="dxa"/>
-              <w:right w:w="90" w:type="dxa"/>
-            </w:tcMar>
-          </w:tcPr>
-          <w:p>
-            <w:pPr>
-              <w:spacing w:after="40" w:before="40"/>
-            </w:pPr>
-            <w:r>
-              <w:rPr>
-                <w:b w:val="0"/>
-                <w:color w:val="000000"/>
-                <w:sz w:val="20"/>
-              </w:rPr>
-              <w:t>94,66%</w:t>
+              <w:t>35</w:t>
             </w:r>
           </w:p>
         </w:tc>
@@ -654,76 +766,55 @@
         </w:trPr>
         <w:tc>
           <w:tcPr>
-            <w:tcW w:type="dxa" w:w="3312"/>
+            <w:tcW w:type="dxa" w:w="7920"/>
+            <w:vAlign w:val="center"/>
             <w:shd w:fill="FFFFFF"/>
             <w:tcMar>
-              <w:top w:w="90" w:type="dxa"/>
-              <w:bottom w:w="90" w:type="dxa"/>
-              <w:left w:w="90" w:type="dxa"/>
-              <w:right w:w="90" w:type="dxa"/>
+              <w:top w:w="95" w:type="dxa"/>
+              <w:bottom w:w="95" w:type="dxa"/>
+              <w:left w:w="95" w:type="dxa"/>
+              <w:right w:w="95" w:type="dxa"/>
             </w:tcMar>
           </w:tcPr>
           <w:p>
             <w:pPr>
-              <w:spacing w:after="40" w:before="40"/>
+              <w:spacing w:before="40" w:after="40" w:line="245" w:lineRule="auto"/>
+              <w:jc w:val="left"/>
             </w:pPr>
             <w:r>
               <w:rPr>
                 <w:b w:val="0"/>
                 <w:color w:val="000000"/>
-                <w:sz w:val="20"/>
+                <w:sz w:val="21"/>
               </w:rPr>
-              <w:t>Funciones</w:t>
+              <w:t>Estado compartido</w:t>
             </w:r>
           </w:p>
         </w:tc>
         <w:tc>
           <w:tcPr>
-            <w:tcW w:type="dxa" w:w="3744"/>
+            <w:tcW w:type="dxa" w:w="2160"/>
+            <w:vAlign w:val="center"/>
             <w:shd w:fill="FFFFFF"/>
             <w:tcMar>
-              <w:top w:w="90" w:type="dxa"/>
-              <w:bottom w:w="90" w:type="dxa"/>
-              <w:left w:w="90" w:type="dxa"/>
-              <w:right w:w="90" w:type="dxa"/>
+              <w:top w:w="95" w:type="dxa"/>
+              <w:bottom w:w="95" w:type="dxa"/>
+              <w:left w:w="95" w:type="dxa"/>
+              <w:right w:w="95" w:type="dxa"/>
             </w:tcMar>
           </w:tcPr>
           <w:p>
             <w:pPr>
-              <w:spacing w:after="40" w:before="40"/>
+              <w:spacing w:before="40" w:after="40" w:line="245" w:lineRule="auto"/>
+              <w:jc w:val="center"/>
             </w:pPr>
             <w:r>
               <w:rPr>
                 <w:b w:val="0"/>
                 <w:color w:val="000000"/>
-                <w:sz w:val="20"/>
+                <w:sz w:val="21"/>
               </w:rPr>
-              <w:t>431 / 434</w:t>
-            </w:r>
-          </w:p>
-        </w:tc>
-        <w:tc>
-          <w:tcPr>
-            <w:tcW w:type="dxa" w:w="2736"/>
-            <w:shd w:fill="FFFFFF"/>
-            <w:tcMar>
-              <w:top w:w="90" w:type="dxa"/>
-              <w:bottom w:w="90" w:type="dxa"/>
-              <w:left w:w="90" w:type="dxa"/>
-              <w:right w:w="90" w:type="dxa"/>
-            </w:tcMar>
-          </w:tcPr>
-          <w:p>
-            <w:pPr>
-              <w:spacing w:after="40" w:before="40"/>
-            </w:pPr>
-            <w:r>
-              <w:rPr>
-                <w:b w:val="0"/>
-                <w:color w:val="000000"/>
-                <w:sz w:val="20"/>
-              </w:rPr>
-              <w:t>99,30%</w:t>
+              <w:t>27</w:t>
             </w:r>
           </w:p>
         </w:tc>
@@ -734,125 +825,377 @@
         </w:trPr>
         <w:tc>
           <w:tcPr>
-            <w:tcW w:type="dxa" w:w="3312"/>
-            <w:shd w:fill="F2F2F2"/>
+            <w:tcW w:type="dxa" w:w="7920"/>
+            <w:vAlign w:val="center"/>
+            <w:shd w:fill="F3F3F3"/>
             <w:tcMar>
-              <w:top w:w="90" w:type="dxa"/>
-              <w:bottom w:w="90" w:type="dxa"/>
-              <w:left w:w="90" w:type="dxa"/>
-              <w:right w:w="90" w:type="dxa"/>
+              <w:top w:w="95" w:type="dxa"/>
+              <w:bottom w:w="95" w:type="dxa"/>
+              <w:left w:w="95" w:type="dxa"/>
+              <w:right w:w="95" w:type="dxa"/>
             </w:tcMar>
           </w:tcPr>
           <w:p>
             <w:pPr>
-              <w:spacing w:after="40" w:before="40"/>
+              <w:spacing w:before="40" w:after="40" w:line="245" w:lineRule="auto"/>
+              <w:jc w:val="left"/>
             </w:pPr>
             <w:r>
               <w:rPr>
                 <w:b w:val="0"/>
                 <w:color w:val="000000"/>
-                <w:sz w:val="20"/>
+                <w:sz w:val="21"/>
               </w:rPr>
-              <w:t>Líneas</w:t>
+              <w:t>Control de rutas</w:t>
             </w:r>
           </w:p>
         </w:tc>
         <w:tc>
           <w:tcPr>
-            <w:tcW w:type="dxa" w:w="3744"/>
-            <w:shd w:fill="F2F2F2"/>
+            <w:tcW w:type="dxa" w:w="2160"/>
+            <w:vAlign w:val="center"/>
+            <w:shd w:fill="F3F3F3"/>
             <w:tcMar>
-              <w:top w:w="90" w:type="dxa"/>
-              <w:bottom w:w="90" w:type="dxa"/>
-              <w:left w:w="90" w:type="dxa"/>
-              <w:right w:w="90" w:type="dxa"/>
+              <w:top w:w="95" w:type="dxa"/>
+              <w:bottom w:w="95" w:type="dxa"/>
+              <w:left w:w="95" w:type="dxa"/>
+              <w:right w:w="95" w:type="dxa"/>
             </w:tcMar>
           </w:tcPr>
           <w:p>
             <w:pPr>
-              <w:spacing w:after="40" w:before="40"/>
+              <w:spacing w:before="40" w:after="40" w:line="245" w:lineRule="auto"/>
+              <w:jc w:val="center"/>
             </w:pPr>
             <w:r>
               <w:rPr>
                 <w:b w:val="0"/>
                 <w:color w:val="000000"/>
-                <w:sz w:val="20"/>
+                <w:sz w:val="21"/>
               </w:rPr>
-              <w:t>1077 / 1088</w:t>
+              <w:t>15</w:t>
+            </w:r>
+          </w:p>
+        </w:tc>
+      </w:tr>
+      <w:tr>
+        <w:trPr>
+          <w:cantSplit/>
+        </w:trPr>
+        <w:tc>
+          <w:tcPr>
+            <w:tcW w:type="dxa" w:w="7920"/>
+            <w:vAlign w:val="center"/>
+            <w:shd w:fill="FFFFFF"/>
+            <w:tcMar>
+              <w:top w:w="95" w:type="dxa"/>
+              <w:bottom w:w="95" w:type="dxa"/>
+              <w:left w:w="95" w:type="dxa"/>
+              <w:right w:w="95" w:type="dxa"/>
+            </w:tcMar>
+          </w:tcPr>
+          <w:p>
+            <w:pPr>
+              <w:spacing w:before="40" w:after="40" w:line="245" w:lineRule="auto"/>
+              <w:jc w:val="left"/>
+            </w:pPr>
+            <w:r>
+              <w:rPr>
+                <w:b w:val="0"/>
+                <w:color w:val="000000"/>
+                <w:sz w:val="21"/>
+              </w:rPr>
+              <w:t>Servicios de datos</w:t>
             </w:r>
           </w:p>
         </w:tc>
         <w:tc>
           <w:tcPr>
-            <w:tcW w:type="dxa" w:w="2736"/>
-            <w:shd w:fill="F2F2F2"/>
+            <w:tcW w:type="dxa" w:w="2160"/>
+            <w:vAlign w:val="center"/>
+            <w:shd w:fill="FFFFFF"/>
             <w:tcMar>
-              <w:top w:w="90" w:type="dxa"/>
-              <w:bottom w:w="90" w:type="dxa"/>
-              <w:left w:w="90" w:type="dxa"/>
-              <w:right w:w="90" w:type="dxa"/>
+              <w:top w:w="95" w:type="dxa"/>
+              <w:bottom w:w="95" w:type="dxa"/>
+              <w:left w:w="95" w:type="dxa"/>
+              <w:right w:w="95" w:type="dxa"/>
             </w:tcMar>
           </w:tcPr>
           <w:p>
             <w:pPr>
-              <w:spacing w:after="40" w:before="40"/>
+              <w:spacing w:before="40" w:after="40" w:line="245" w:lineRule="auto"/>
+              <w:jc w:val="center"/>
             </w:pPr>
             <w:r>
               <w:rPr>
                 <w:b w:val="0"/>
                 <w:color w:val="000000"/>
-                <w:sz w:val="20"/>
+                <w:sz w:val="21"/>
               </w:rPr>
-              <w:t>98,98%</w:t>
+              <w:t>115</w:t>
+            </w:r>
+          </w:p>
+        </w:tc>
+      </w:tr>
+      <w:tr>
+        <w:trPr>
+          <w:cantSplit/>
+        </w:trPr>
+        <w:tc>
+          <w:tcPr>
+            <w:tcW w:type="dxa" w:w="7920"/>
+            <w:vAlign w:val="center"/>
+            <w:shd w:fill="F3F3F3"/>
+            <w:tcMar>
+              <w:top w:w="95" w:type="dxa"/>
+              <w:bottom w:w="95" w:type="dxa"/>
+              <w:left w:w="95" w:type="dxa"/>
+              <w:right w:w="95" w:type="dxa"/>
+            </w:tcMar>
+          </w:tcPr>
+          <w:p>
+            <w:pPr>
+              <w:spacing w:before="40" w:after="40" w:line="245" w:lineRule="auto"/>
+              <w:jc w:val="left"/>
+            </w:pPr>
+            <w:r>
+              <w:rPr>
+                <w:b w:val="0"/>
+                <w:color w:val="000000"/>
+                <w:sz w:val="21"/>
+              </w:rPr>
+              <w:t>Utilidades y validaciones</w:t>
+            </w:r>
+          </w:p>
+        </w:tc>
+        <w:tc>
+          <w:tcPr>
+            <w:tcW w:type="dxa" w:w="2160"/>
+            <w:vAlign w:val="center"/>
+            <w:shd w:fill="F3F3F3"/>
+            <w:tcMar>
+              <w:top w:w="95" w:type="dxa"/>
+              <w:bottom w:w="95" w:type="dxa"/>
+              <w:left w:w="95" w:type="dxa"/>
+              <w:right w:w="95" w:type="dxa"/>
+            </w:tcMar>
+          </w:tcPr>
+          <w:p>
+            <w:pPr>
+              <w:spacing w:before="40" w:after="40" w:line="245" w:lineRule="auto"/>
+              <w:jc w:val="center"/>
+            </w:pPr>
+            <w:r>
+              <w:rPr>
+                <w:b w:val="0"/>
+                <w:color w:val="000000"/>
+                <w:sz w:val="21"/>
+              </w:rPr>
+              <w:t>96</w:t>
+            </w:r>
+          </w:p>
+        </w:tc>
+      </w:tr>
+      <w:tr>
+        <w:trPr>
+          <w:cantSplit/>
+        </w:trPr>
+        <w:tc>
+          <w:tcPr>
+            <w:tcW w:type="dxa" w:w="7920"/>
+            <w:vAlign w:val="center"/>
+            <w:shd w:fill="FFFFFF"/>
+            <w:tcMar>
+              <w:top w:w="95" w:type="dxa"/>
+              <w:bottom w:w="95" w:type="dxa"/>
+              <w:left w:w="95" w:type="dxa"/>
+              <w:right w:w="95" w:type="dxa"/>
+            </w:tcMar>
+          </w:tcPr>
+          <w:p>
+            <w:pPr>
+              <w:spacing w:before="40" w:after="40" w:line="245" w:lineRule="auto"/>
+              <w:jc w:val="left"/>
+            </w:pPr>
+            <w:r>
+              <w:rPr>
+                <w:b w:val="0"/>
+                <w:color w:val="000000"/>
+                <w:sz w:val="21"/>
+              </w:rPr>
+              <w:t>Recorridos integrados de la aplicación</w:t>
+            </w:r>
+          </w:p>
+        </w:tc>
+        <w:tc>
+          <w:tcPr>
+            <w:tcW w:type="dxa" w:w="2160"/>
+            <w:vAlign w:val="center"/>
+            <w:shd w:fill="FFFFFF"/>
+            <w:tcMar>
+              <w:top w:w="95" w:type="dxa"/>
+              <w:bottom w:w="95" w:type="dxa"/>
+              <w:left w:w="95" w:type="dxa"/>
+              <w:right w:w="95" w:type="dxa"/>
+            </w:tcMar>
+          </w:tcPr>
+          <w:p>
+            <w:pPr>
+              <w:spacing w:before="40" w:after="40" w:line="245" w:lineRule="auto"/>
+              <w:jc w:val="center"/>
+            </w:pPr>
+            <w:r>
+              <w:rPr>
+                <w:b w:val="0"/>
+                <w:color w:val="000000"/>
+                <w:sz w:val="21"/>
+              </w:rPr>
+              <w:t>169</w:t>
+            </w:r>
+          </w:p>
+        </w:tc>
+      </w:tr>
+      <w:tr>
+        <w:trPr>
+          <w:cantSplit/>
+        </w:trPr>
+        <w:tc>
+          <w:tcPr>
+            <w:tcW w:type="dxa" w:w="7920"/>
+            <w:vAlign w:val="center"/>
+            <w:shd w:fill="F3F3F3"/>
+            <w:tcMar>
+              <w:top w:w="95" w:type="dxa"/>
+              <w:bottom w:w="95" w:type="dxa"/>
+              <w:left w:w="95" w:type="dxa"/>
+              <w:right w:w="95" w:type="dxa"/>
+            </w:tcMar>
+          </w:tcPr>
+          <w:p>
+            <w:pPr>
+              <w:spacing w:before="40" w:after="40" w:line="245" w:lineRule="auto"/>
+              <w:jc w:val="left"/>
+            </w:pPr>
+            <w:r>
+              <w:rPr>
+                <w:b w:val="0"/>
+                <w:color w:val="000000"/>
+                <w:sz w:val="21"/>
+              </w:rPr>
+              <w:t>Total</w:t>
+            </w:r>
+          </w:p>
+        </w:tc>
+        <w:tc>
+          <w:tcPr>
+            <w:tcW w:type="dxa" w:w="2160"/>
+            <w:vAlign w:val="center"/>
+            <w:shd w:fill="F3F3F3"/>
+            <w:tcMar>
+              <w:top w:w="95" w:type="dxa"/>
+              <w:bottom w:w="95" w:type="dxa"/>
+              <w:left w:w="95" w:type="dxa"/>
+              <w:right w:w="95" w:type="dxa"/>
+            </w:tcMar>
+          </w:tcPr>
+          <w:p>
+            <w:pPr>
+              <w:spacing w:before="40" w:after="40" w:line="245" w:lineRule="auto"/>
+              <w:jc w:val="center"/>
+            </w:pPr>
+            <w:r>
+              <w:rPr>
+                <w:b w:val="0"/>
+                <w:color w:val="000000"/>
+                <w:sz w:val="21"/>
+              </w:rPr>
+              <w:t>597</w:t>
             </w:r>
           </w:p>
         </w:tc>
       </w:tr>
     </w:tbl>
     <w:p>
+      <w:pPr>
+        <w:spacing w:after="40" w:before="0" w:line="40" w:lineRule="exact"/>
+      </w:pPr>
       <w:r>
-        <w:t>La cobertura describe ejecución del código instrumentado. No es un porcentaje de migración, de requisitos satisfechos ni una garantía de ausencia de defectos.</w:t>
+        <w:rPr>
+          <w:sz w:val="4"/>
+        </w:rPr>
+      </w:r>
+    </w:p>
+    <w:p>
+      <w:pPr>
+        <w:pStyle w:val="Heading2"/>
+      </w:pPr>
+      <w:r>
+        <w:t>Ejecución y aislamiento</w:t>
+      </w:r>
+    </w:p>
+    <w:p>
+      <w:pPr>
+        <w:widowControl/>
+      </w:pPr>
+      <w:r>
+        <w:t>Cada caso organiza la preparación de datos, la acción y la comprobación del resultado. Los conjuntos con persistencia reinician el almacenamiento y restauran los dobles utilizados para evitar interferencias entre casos.</w:t>
+      </w:r>
+    </w:p>
+    <w:p>
+      <w:pPr>
+        <w:pStyle w:val="Heading2"/>
+      </w:pPr>
+      <w:r>
+        <w:t>Dobles de prueba</w:t>
+      </w:r>
+    </w:p>
+    <w:p>
+      <w:pPr>
+        <w:widowControl/>
+      </w:pPr>
+      <w:r>
+        <w:t>Los mocks registran llamadas y argumentos de los eventos. Los espías sobre el almacenamiento provocan fallos controlados para comprobar que una operación no deje datos parciales ni elimine información previa. El control de fechas permite resultados deterministas cuando los casos lo requieren.</w:t>
+      </w:r>
+    </w:p>
+    <w:p>
+      <w:pPr>
+        <w:widowControl/>
+      </w:pPr>
+      <w:r>
+        <w:t>El entorno simulado sustituye capacidades de desplazamiento y diálogos que no reproduce de forma nativa. Estas sustituciones permiten verificar estados y mensajes, mientras la apariencia y la interacción visual se comprueban por separado en navegador.</w:t>
+      </w:r>
+    </w:p>
+    <w:p>
+      <w:pPr>
+        <w:pStyle w:val="Heading2"/>
+      </w:pPr>
+      <w:r>
+        <w:t>Frecuencia de verificación</w:t>
+      </w:r>
+    </w:p>
+    <w:p>
+      <w:pPr>
+        <w:widowControl/>
+      </w:pPr>
+      <w:r>
+        <w:t>Durante una modificación se ejecutan las pruebas del área afectada. Los cambios compartidos y el cierre de una versión requieren regresión completa; la cobertura se vuelve a medir cuando se actualiza la evidencia de calidad.</w:t>
       </w:r>
     </w:p>
     <w:p>
       <w:pPr>
         <w:pStyle w:val="Heading1"/>
+        <w:pageBreakBefore/>
       </w:pPr>
       <w:r>
-        <w:t>Identificación de la evidencia</w:t>
-      </w:r>
-    </w:p>
-    <w:p>
-      <w:r>
-        <w:t>Rama feature/react-migration. La suite se ejecutó sobre a4c13bc. El ajuste visual posterior 55f03c3 modifica únicamente CSS. Se comprobó la igualdad del contenido JS/JSX, package.json, package-lock.json y vite.config.js entre ambos cortes, normalizando LF/CRLF; se recompiló y revisó la corrección en navegador.</w:t>
-      </w:r>
-    </w:p>
-    <w:p>
-      <w:r>
-        <w:t>Entorno observado: Windows, Node.js 24.22.1, npm 11.19.1, Vitest 5.0.5, jsdom 30.1.3 y Vite 8.3.5. La pauta menciona Jasmine y Karma; Vitest fue autorizado por el docente según confirmación del estudiante.</w:t>
-      </w:r>
-    </w:p>
-    <w:p>
-      <w:r>
-        <w:br w:type="page"/>
+        <w:t>Casos representativos y resultados</w:t>
       </w:r>
     </w:p>
     <w:p>
       <w:pPr>
-        <w:pStyle w:val="Heading1"/>
+        <w:widowControl/>
       </w:pPr>
       <w:r>
-        <w:t>Proceso y distribución de las pruebas</w:t>
-      </w:r>
-    </w:p>
-    <w:p>
-      <w:r>
-        <w:t>Vitest ejecuta los casos con jsdom y React Testing Library. userEvent simula acciones y jest-dom aporta aserciones legibles. MemoryRouter permite comprobar navegación sin servidor. Los casos de integración montan proveedores y rutas reales; las pruebas de servicios y utilidades aíslan reglas de negocio y almacenamiento.</w:t>
-      </w:r>
-    </w:p>
-    <w:p>
-      <w:r>
-        <w:t>Los casos siguen preparación, acción y comprobación. Los conjuntos que dependen de persistencia reinician LocalStorage; los spies se restauran después de su uso. La configuración limita maxWorkers a 2 para reducir competencia de CPU y memoria y conserva el límite de 5 segundos por prueba y el aislamiento entre archivos.</w:t>
+        <w:t>Los siguientes diez casos forman parte de la ejecución aprobada y muestran verificaciones de presentación, interacción, reglas y recuperación. La selección permite explicar qué condición se prepara, qué acción ocurre y qué resultado se espera.</w:t>
       </w:r>
     </w:p>
     <w:tbl>
@@ -870,9 +1213,9 @@
         </w:tblBorders>
       </w:tblPr>
       <w:tblGrid>
-        <w:gridCol w:w="6048"/>
-        <w:gridCol w:w="1872"/>
-        <w:gridCol w:w="1872"/>
+        <w:gridCol w:w="2304"/>
+        <w:gridCol w:w="6192"/>
+        <w:gridCol w:w="1296"/>
       </w:tblGrid>
       <w:tr>
         <w:trPr>
@@ -881,76 +1224,82 @@
         </w:trPr>
         <w:tc>
           <w:tcPr>
-            <w:tcW w:type="dxa" w:w="6048"/>
+            <w:tcW w:type="dxa" w:w="2304"/>
+            <w:vAlign w:val="center"/>
             <w:shd w:fill="333333"/>
             <w:tcMar>
-              <w:top w:w="90" w:type="dxa"/>
-              <w:bottom w:w="90" w:type="dxa"/>
-              <w:left w:w="90" w:type="dxa"/>
-              <w:right w:w="90" w:type="dxa"/>
+              <w:top w:w="95" w:type="dxa"/>
+              <w:bottom w:w="95" w:type="dxa"/>
+              <w:left w:w="95" w:type="dxa"/>
+              <w:right w:w="95" w:type="dxa"/>
             </w:tcMar>
           </w:tcPr>
           <w:p>
             <w:pPr>
-              <w:spacing w:after="40" w:before="40"/>
+              <w:spacing w:before="40" w:after="40" w:line="245" w:lineRule="auto"/>
+              <w:jc w:val="left"/>
             </w:pPr>
             <w:r>
               <w:rPr>
                 <w:b/>
                 <w:color w:val="FFFFFF"/>
-                <w:sz w:val="20"/>
+                <w:sz w:val="21"/>
               </w:rPr>
-              <w:t>Grupo de archivos</w:t>
+              <w:t>Caso</w:t>
             </w:r>
           </w:p>
         </w:tc>
         <w:tc>
           <w:tcPr>
-            <w:tcW w:type="dxa" w:w="1872"/>
+            <w:tcW w:type="dxa" w:w="6192"/>
+            <w:vAlign w:val="center"/>
             <w:shd w:fill="333333"/>
             <w:tcMar>
-              <w:top w:w="90" w:type="dxa"/>
-              <w:bottom w:w="90" w:type="dxa"/>
-              <w:left w:w="90" w:type="dxa"/>
-              <w:right w:w="90" w:type="dxa"/>
+              <w:top w:w="95" w:type="dxa"/>
+              <w:bottom w:w="95" w:type="dxa"/>
+              <w:left w:w="95" w:type="dxa"/>
+              <w:right w:w="95" w:type="dxa"/>
             </w:tcMar>
           </w:tcPr>
           <w:p>
             <w:pPr>
-              <w:spacing w:after="40" w:before="40"/>
+              <w:spacing w:before="40" w:after="40" w:line="245" w:lineRule="auto"/>
+              <w:jc w:val="left"/>
             </w:pPr>
             <w:r>
               <w:rPr>
                 <w:b/>
                 <w:color w:val="FFFFFF"/>
-                <w:sz w:val="20"/>
+                <w:sz w:val="21"/>
               </w:rPr>
-              <w:t>Archivos</w:t>
+              <w:t>Comportamiento comprobado</w:t>
             </w:r>
           </w:p>
         </w:tc>
         <w:tc>
           <w:tcPr>
-            <w:tcW w:type="dxa" w:w="1872"/>
+            <w:tcW w:type="dxa" w:w="1296"/>
+            <w:vAlign w:val="center"/>
             <w:shd w:fill="333333"/>
             <w:tcMar>
-              <w:top w:w="90" w:type="dxa"/>
-              <w:bottom w:w="90" w:type="dxa"/>
-              <w:left w:w="90" w:type="dxa"/>
-              <w:right w:w="90" w:type="dxa"/>
+              <w:top w:w="95" w:type="dxa"/>
+              <w:bottom w:w="95" w:type="dxa"/>
+              <w:left w:w="95" w:type="dxa"/>
+              <w:right w:w="95" w:type="dxa"/>
             </w:tcMar>
           </w:tcPr>
           <w:p>
             <w:pPr>
-              <w:spacing w:after="40" w:before="40"/>
+              <w:spacing w:before="40" w:after="40" w:line="245" w:lineRule="auto"/>
+              <w:jc w:val="center"/>
             </w:pPr>
             <w:r>
               <w:rPr>
                 <w:b/>
                 <w:color w:val="FFFFFF"/>
-                <w:sz w:val="20"/>
+                <w:sz w:val="21"/>
               </w:rPr>
-              <w:t>Pruebas</w:t>
+              <w:t>Resultado</w:t>
             </w:r>
           </w:p>
         </w:tc>
@@ -961,76 +1310,82 @@
         </w:trPr>
         <w:tc>
           <w:tcPr>
-            <w:tcW w:type="dxa" w:w="6048"/>
+            <w:tcW w:type="dxa" w:w="2304"/>
+            <w:vAlign w:val="center"/>
             <w:shd w:fill="FFFFFF"/>
             <w:tcMar>
-              <w:top w:w="90" w:type="dxa"/>
-              <w:bottom w:w="90" w:type="dxa"/>
-              <w:left w:w="90" w:type="dxa"/>
-              <w:right w:w="90" w:type="dxa"/>
+              <w:top w:w="95" w:type="dxa"/>
+              <w:bottom w:w="95" w:type="dxa"/>
+              <w:left w:w="95" w:type="dxa"/>
+              <w:right w:w="95" w:type="dxa"/>
             </w:tcMar>
           </w:tcPr>
           <w:p>
             <w:pPr>
-              <w:spacing w:after="40" w:before="40"/>
+              <w:spacing w:before="40" w:after="40" w:line="245" w:lineRule="auto"/>
+              <w:jc w:val="left"/>
             </w:pPr>
             <w:r>
               <w:rPr>
                 <w:b w:val="0"/>
                 <w:color w:val="000000"/>
-                <w:sz w:val="20"/>
+                <w:sz w:val="21"/>
               </w:rPr>
-              <w:t>src (integración)</w:t>
+              <w:t>1 · Datos del producto</w:t>
             </w:r>
           </w:p>
         </w:tc>
         <w:tc>
           <w:tcPr>
-            <w:tcW w:type="dxa" w:w="1872"/>
+            <w:tcW w:type="dxa" w:w="6192"/>
+            <w:vAlign w:val="center"/>
             <w:shd w:fill="FFFFFF"/>
             <w:tcMar>
-              <w:top w:w="90" w:type="dxa"/>
-              <w:bottom w:w="90" w:type="dxa"/>
-              <w:left w:w="90" w:type="dxa"/>
-              <w:right w:w="90" w:type="dxa"/>
+              <w:top w:w="95" w:type="dxa"/>
+              <w:bottom w:w="95" w:type="dxa"/>
+              <w:left w:w="95" w:type="dxa"/>
+              <w:right w:w="95" w:type="dxa"/>
             </w:tcMar>
           </w:tcPr>
           <w:p>
             <w:pPr>
-              <w:spacing w:after="40" w:before="40"/>
+              <w:spacing w:before="40" w:after="40" w:line="245" w:lineRule="auto"/>
+              <w:jc w:val="left"/>
             </w:pPr>
             <w:r>
               <w:rPr>
                 <w:b w:val="0"/>
                 <w:color w:val="000000"/>
-                <w:sz w:val="20"/>
+                <w:sz w:val="21"/>
               </w:rPr>
-              <w:t>11</w:t>
+              <w:t>La tarjeta presenta nombre, categoría y precio recibidos mediante propiedades.</w:t>
             </w:r>
           </w:p>
         </w:tc>
         <w:tc>
           <w:tcPr>
-            <w:tcW w:type="dxa" w:w="1872"/>
+            <w:tcW w:type="dxa" w:w="1296"/>
+            <w:vAlign w:val="center"/>
             <w:shd w:fill="FFFFFF"/>
             <w:tcMar>
-              <w:top w:w="90" w:type="dxa"/>
-              <w:bottom w:w="90" w:type="dxa"/>
-              <w:left w:w="90" w:type="dxa"/>
-              <w:right w:w="90" w:type="dxa"/>
+              <w:top w:w="95" w:type="dxa"/>
+              <w:bottom w:w="95" w:type="dxa"/>
+              <w:left w:w="95" w:type="dxa"/>
+              <w:right w:w="95" w:type="dxa"/>
             </w:tcMar>
           </w:tcPr>
           <w:p>
             <w:pPr>
-              <w:spacing w:after="40" w:before="40"/>
+              <w:spacing w:before="40" w:after="40" w:line="245" w:lineRule="auto"/>
+              <w:jc w:val="center"/>
             </w:pPr>
             <w:r>
               <w:rPr>
                 <w:b w:val="0"/>
                 <w:color w:val="000000"/>
-                <w:sz w:val="20"/>
+                <w:sz w:val="21"/>
               </w:rPr>
-              <w:t>169</w:t>
+              <w:t>Aprobado</w:t>
             </w:r>
           </w:p>
         </w:tc>
@@ -1041,76 +1396,82 @@
         </w:trPr>
         <w:tc>
           <w:tcPr>
-            <w:tcW w:type="dxa" w:w="6048"/>
-            <w:shd w:fill="F2F2F2"/>
+            <w:tcW w:type="dxa" w:w="2304"/>
+            <w:vAlign w:val="center"/>
+            <w:shd w:fill="F3F3F3"/>
             <w:tcMar>
-              <w:top w:w="90" w:type="dxa"/>
-              <w:bottom w:w="90" w:type="dxa"/>
-              <w:left w:w="90" w:type="dxa"/>
-              <w:right w:w="90" w:type="dxa"/>
+              <w:top w:w="95" w:type="dxa"/>
+              <w:bottom w:w="95" w:type="dxa"/>
+              <w:left w:w="95" w:type="dxa"/>
+              <w:right w:w="95" w:type="dxa"/>
             </w:tcMar>
           </w:tcPr>
           <w:p>
             <w:pPr>
-              <w:spacing w:after="40" w:before="40"/>
+              <w:spacing w:before="40" w:after="40" w:line="245" w:lineRule="auto"/>
+              <w:jc w:val="left"/>
             </w:pPr>
             <w:r>
               <w:rPr>
                 <w:b w:val="0"/>
                 <w:color w:val="000000"/>
-                <w:sz w:val="20"/>
+                <w:sz w:val="21"/>
               </w:rPr>
-              <w:t>atoms</w:t>
+              <w:t>2 · Acción de agregar</w:t>
             </w:r>
           </w:p>
         </w:tc>
         <w:tc>
           <w:tcPr>
-            <w:tcW w:type="dxa" w:w="1872"/>
-            <w:shd w:fill="F2F2F2"/>
+            <w:tcW w:type="dxa" w:w="6192"/>
+            <w:vAlign w:val="center"/>
+            <w:shd w:fill="F3F3F3"/>
             <w:tcMar>
-              <w:top w:w="90" w:type="dxa"/>
-              <w:bottom w:w="90" w:type="dxa"/>
-              <w:left w:w="90" w:type="dxa"/>
-              <w:right w:w="90" w:type="dxa"/>
+              <w:top w:w="95" w:type="dxa"/>
+              <w:bottom w:w="95" w:type="dxa"/>
+              <w:left w:w="95" w:type="dxa"/>
+              <w:right w:w="95" w:type="dxa"/>
             </w:tcMar>
           </w:tcPr>
           <w:p>
             <w:pPr>
-              <w:spacing w:after="40" w:before="40"/>
+              <w:spacing w:before="40" w:after="40" w:line="245" w:lineRule="auto"/>
+              <w:jc w:val="left"/>
             </w:pPr>
             <w:r>
               <w:rPr>
                 <w:b w:val="0"/>
                 <w:color w:val="000000"/>
-                <w:sz w:val="20"/>
+                <w:sz w:val="21"/>
               </w:rPr>
-              <w:t>7</w:t>
+              <w:t>El evento entrega el producto correcto al callback asociado al carrito.</w:t>
             </w:r>
           </w:p>
         </w:tc>
         <w:tc>
           <w:tcPr>
-            <w:tcW w:type="dxa" w:w="1872"/>
-            <w:shd w:fill="F2F2F2"/>
+            <w:tcW w:type="dxa" w:w="1296"/>
+            <w:vAlign w:val="center"/>
+            <w:shd w:fill="F3F3F3"/>
             <w:tcMar>
-              <w:top w:w="90" w:type="dxa"/>
-              <w:bottom w:w="90" w:type="dxa"/>
-              <w:left w:w="90" w:type="dxa"/>
-              <w:right w:w="90" w:type="dxa"/>
+              <w:top w:w="95" w:type="dxa"/>
+              <w:bottom w:w="95" w:type="dxa"/>
+              <w:left w:w="95" w:type="dxa"/>
+              <w:right w:w="95" w:type="dxa"/>
             </w:tcMar>
           </w:tcPr>
           <w:p>
             <w:pPr>
-              <w:spacing w:after="40" w:before="40"/>
+              <w:spacing w:before="40" w:after="40" w:line="245" w:lineRule="auto"/>
+              <w:jc w:val="center"/>
             </w:pPr>
             <w:r>
               <w:rPr>
                 <w:b w:val="0"/>
                 <w:color w:val="000000"/>
-                <w:sz w:val="20"/>
+                <w:sz w:val="21"/>
               </w:rPr>
-              <w:t>21</w:t>
+              <w:t>Aprobado</w:t>
             </w:r>
           </w:p>
         </w:tc>
@@ -1121,76 +1482,82 @@
         </w:trPr>
         <w:tc>
           <w:tcPr>
-            <w:tcW w:type="dxa" w:w="6048"/>
+            <w:tcW w:type="dxa" w:w="2304"/>
+            <w:vAlign w:val="center"/>
             <w:shd w:fill="FFFFFF"/>
             <w:tcMar>
-              <w:top w:w="90" w:type="dxa"/>
-              <w:bottom w:w="90" w:type="dxa"/>
-              <w:left w:w="90" w:type="dxa"/>
-              <w:right w:w="90" w:type="dxa"/>
+              <w:top w:w="95" w:type="dxa"/>
+              <w:bottom w:w="95" w:type="dxa"/>
+              <w:left w:w="95" w:type="dxa"/>
+              <w:right w:w="95" w:type="dxa"/>
             </w:tcMar>
           </w:tcPr>
           <w:p>
             <w:pPr>
-              <w:spacing w:after="40" w:before="40"/>
+              <w:spacing w:before="40" w:after="40" w:line="245" w:lineRule="auto"/>
+              <w:jc w:val="left"/>
             </w:pPr>
             <w:r>
               <w:rPr>
                 <w:b w:val="0"/>
                 <w:color w:val="000000"/>
-                <w:sz w:val="20"/>
+                <w:sz w:val="21"/>
               </w:rPr>
-              <w:t>molecules</w:t>
+              <w:t>3 · Producto agotado</w:t>
             </w:r>
           </w:p>
         </w:tc>
         <w:tc>
           <w:tcPr>
-            <w:tcW w:type="dxa" w:w="1872"/>
+            <w:tcW w:type="dxa" w:w="6192"/>
+            <w:vAlign w:val="center"/>
             <w:shd w:fill="FFFFFF"/>
             <w:tcMar>
-              <w:top w:w="90" w:type="dxa"/>
-              <w:bottom w:w="90" w:type="dxa"/>
-              <w:left w:w="90" w:type="dxa"/>
-              <w:right w:w="90" w:type="dxa"/>
+              <w:top w:w="95" w:type="dxa"/>
+              <w:bottom w:w="95" w:type="dxa"/>
+              <w:left w:w="95" w:type="dxa"/>
+              <w:right w:w="95" w:type="dxa"/>
             </w:tcMar>
           </w:tcPr>
           <w:p>
             <w:pPr>
-              <w:spacing w:after="40" w:before="40"/>
+              <w:spacing w:before="40" w:after="40" w:line="245" w:lineRule="auto"/>
+              <w:jc w:val="left"/>
             </w:pPr>
             <w:r>
               <w:rPr>
                 <w:b w:val="0"/>
                 <w:color w:val="000000"/>
-                <w:sz w:val="20"/>
+                <w:sz w:val="21"/>
               </w:rPr>
-              <w:t>12</w:t>
+              <w:t>Un stock de cero muestra el estado Sin stock, por encima de la alerta de stock crítico.</w:t>
             </w:r>
           </w:p>
         </w:tc>
         <w:tc>
           <w:tcPr>
-            <w:tcW w:type="dxa" w:w="1872"/>
+            <w:tcW w:type="dxa" w:w="1296"/>
+            <w:vAlign w:val="center"/>
             <w:shd w:fill="FFFFFF"/>
             <w:tcMar>
-              <w:top w:w="90" w:type="dxa"/>
-              <w:bottom w:w="90" w:type="dxa"/>
-              <w:left w:w="90" w:type="dxa"/>
-              <w:right w:w="90" w:type="dxa"/>
+              <w:top w:w="95" w:type="dxa"/>
+              <w:bottom w:w="95" w:type="dxa"/>
+              <w:left w:w="95" w:type="dxa"/>
+              <w:right w:w="95" w:type="dxa"/>
             </w:tcMar>
           </w:tcPr>
           <w:p>
             <w:pPr>
-              <w:spacing w:after="40" w:before="40"/>
+              <w:spacing w:before="40" w:after="40" w:line="245" w:lineRule="auto"/>
+              <w:jc w:val="center"/>
             </w:pPr>
             <w:r>
               <w:rPr>
                 <w:b w:val="0"/>
                 <w:color w:val="000000"/>
-                <w:sz w:val="20"/>
+                <w:sz w:val="21"/>
               </w:rPr>
-              <w:t>34</w:t>
+              <w:t>Aprobado</w:t>
             </w:r>
           </w:p>
         </w:tc>
@@ -1201,76 +1568,82 @@
         </w:trPr>
         <w:tc>
           <w:tcPr>
-            <w:tcW w:type="dxa" w:w="6048"/>
-            <w:shd w:fill="F2F2F2"/>
+            <w:tcW w:type="dxa" w:w="2304"/>
+            <w:vAlign w:val="center"/>
+            <w:shd w:fill="F3F3F3"/>
             <w:tcMar>
-              <w:top w:w="90" w:type="dxa"/>
-              <w:bottom w:w="90" w:type="dxa"/>
-              <w:left w:w="90" w:type="dxa"/>
-              <w:right w:w="90" w:type="dxa"/>
+              <w:top w:w="95" w:type="dxa"/>
+              <w:bottom w:w="95" w:type="dxa"/>
+              <w:left w:w="95" w:type="dxa"/>
+              <w:right w:w="95" w:type="dxa"/>
             </w:tcMar>
           </w:tcPr>
           <w:p>
             <w:pPr>
-              <w:spacing w:after="40" w:before="40"/>
+              <w:spacing w:before="40" w:after="40" w:line="245" w:lineRule="auto"/>
+              <w:jc w:val="left"/>
             </w:pPr>
             <w:r>
               <w:rPr>
                 <w:b w:val="0"/>
                 <w:color w:val="000000"/>
-                <w:sz w:val="20"/>
+                <w:sz w:val="21"/>
               </w:rPr>
-              <w:t>organisms</w:t>
+              <w:t>4 · Cantidades bloqueadas</w:t>
             </w:r>
           </w:p>
         </w:tc>
         <w:tc>
           <w:tcPr>
-            <w:tcW w:type="dxa" w:w="1872"/>
-            <w:shd w:fill="F2F2F2"/>
+            <w:tcW w:type="dxa" w:w="6192"/>
+            <w:vAlign w:val="center"/>
+            <w:shd w:fill="F3F3F3"/>
             <w:tcMar>
-              <w:top w:w="90" w:type="dxa"/>
-              <w:bottom w:w="90" w:type="dxa"/>
-              <w:left w:w="90" w:type="dxa"/>
-              <w:right w:w="90" w:type="dxa"/>
+              <w:top w:w="95" w:type="dxa"/>
+              <w:bottom w:w="95" w:type="dxa"/>
+              <w:left w:w="95" w:type="dxa"/>
+              <w:right w:w="95" w:type="dxa"/>
             </w:tcMar>
           </w:tcPr>
           <w:p>
             <w:pPr>
-              <w:spacing w:after="40" w:before="40"/>
+              <w:spacing w:before="40" w:after="40" w:line="245" w:lineRule="auto"/>
+              <w:jc w:val="left"/>
             </w:pPr>
             <w:r>
               <w:rPr>
                 <w:b w:val="0"/>
                 <w:color w:val="000000"/>
-                <w:sz w:val="20"/>
+                <w:sz w:val="21"/>
               </w:rPr>
-              <w:t>20</w:t>
+              <w:t>Los controles deshabilitados no ejecutan callbacks de aumento o disminución.</w:t>
             </w:r>
           </w:p>
         </w:tc>
         <w:tc>
           <w:tcPr>
-            <w:tcW w:type="dxa" w:w="1872"/>
-            <w:shd w:fill="F2F2F2"/>
+            <w:tcW w:type="dxa" w:w="1296"/>
+            <w:vAlign w:val="center"/>
+            <w:shd w:fill="F3F3F3"/>
             <w:tcMar>
-              <w:top w:w="90" w:type="dxa"/>
-              <w:bottom w:w="90" w:type="dxa"/>
-              <w:left w:w="90" w:type="dxa"/>
-              <w:right w:w="90" w:type="dxa"/>
+              <w:top w:w="95" w:type="dxa"/>
+              <w:bottom w:w="95" w:type="dxa"/>
+              <w:left w:w="95" w:type="dxa"/>
+              <w:right w:w="95" w:type="dxa"/>
             </w:tcMar>
           </w:tcPr>
           <w:p>
             <w:pPr>
-              <w:spacing w:after="40" w:before="40"/>
+              <w:spacing w:before="40" w:after="40" w:line="245" w:lineRule="auto"/>
+              <w:jc w:val="center"/>
             </w:pPr>
             <w:r>
               <w:rPr>
                 <w:b w:val="0"/>
                 <w:color w:val="000000"/>
-                <w:sz w:val="20"/>
+                <w:sz w:val="21"/>
               </w:rPr>
-              <w:t>80</w:t>
+              <w:t>Aprobado</w:t>
             </w:r>
           </w:p>
         </w:tc>
@@ -1281,76 +1654,82 @@
         </w:trPr>
         <w:tc>
           <w:tcPr>
-            <w:tcW w:type="dxa" w:w="6048"/>
+            <w:tcW w:type="dxa" w:w="2304"/>
+            <w:vAlign w:val="center"/>
             <w:shd w:fill="FFFFFF"/>
             <w:tcMar>
-              <w:top w:w="90" w:type="dxa"/>
-              <w:bottom w:w="90" w:type="dxa"/>
-              <w:left w:w="90" w:type="dxa"/>
-              <w:right w:w="90" w:type="dxa"/>
+              <w:top w:w="95" w:type="dxa"/>
+              <w:bottom w:w="95" w:type="dxa"/>
+              <w:left w:w="95" w:type="dxa"/>
+              <w:right w:w="95" w:type="dxa"/>
             </w:tcMar>
           </w:tcPr>
           <w:p>
             <w:pPr>
-              <w:spacing w:after="40" w:before="40"/>
+              <w:spacing w:before="40" w:after="40" w:line="245" w:lineRule="auto"/>
+              <w:jc w:val="left"/>
             </w:pPr>
             <w:r>
               <w:rPr>
                 <w:b w:val="0"/>
                 <w:color w:val="000000"/>
-                <w:sz w:val="20"/>
+                <w:sz w:val="21"/>
               </w:rPr>
-              <w:t>templates</w:t>
+              <w:t>5 · Despacho gratuito</w:t>
             </w:r>
           </w:p>
         </w:tc>
         <w:tc>
           <w:tcPr>
-            <w:tcW w:type="dxa" w:w="1872"/>
+            <w:tcW w:type="dxa" w:w="6192"/>
+            <w:vAlign w:val="center"/>
             <w:shd w:fill="FFFFFF"/>
             <w:tcMar>
-              <w:top w:w="90" w:type="dxa"/>
-              <w:bottom w:w="90" w:type="dxa"/>
-              <w:left w:w="90" w:type="dxa"/>
-              <w:right w:w="90" w:type="dxa"/>
+              <w:top w:w="95" w:type="dxa"/>
+              <w:bottom w:w="95" w:type="dxa"/>
+              <w:left w:w="95" w:type="dxa"/>
+              <w:right w:w="95" w:type="dxa"/>
             </w:tcMar>
           </w:tcPr>
           <w:p>
             <w:pPr>
-              <w:spacing w:after="40" w:before="40"/>
+              <w:spacing w:before="40" w:after="40" w:line="245" w:lineRule="auto"/>
+              <w:jc w:val="left"/>
             </w:pPr>
             <w:r>
               <w:rPr>
                 <w:b w:val="0"/>
                 <w:color w:val="000000"/>
-                <w:sz w:val="20"/>
+                <w:sz w:val="21"/>
               </w:rPr>
-              <w:t>2</w:t>
+              <w:t>Dos unidades de $39.990 generan despacho cero y total de $79.980.</w:t>
             </w:r>
           </w:p>
         </w:tc>
         <w:tc>
           <w:tcPr>
-            <w:tcW w:type="dxa" w:w="1872"/>
+            <w:tcW w:type="dxa" w:w="1296"/>
+            <w:vAlign w:val="center"/>
             <w:shd w:fill="FFFFFF"/>
             <w:tcMar>
-              <w:top w:w="90" w:type="dxa"/>
-              <w:bottom w:w="90" w:type="dxa"/>
-              <w:left w:w="90" w:type="dxa"/>
-              <w:right w:w="90" w:type="dxa"/>
+              <w:top w:w="95" w:type="dxa"/>
+              <w:bottom w:w="95" w:type="dxa"/>
+              <w:left w:w="95" w:type="dxa"/>
+              <w:right w:w="95" w:type="dxa"/>
             </w:tcMar>
           </w:tcPr>
           <w:p>
             <w:pPr>
-              <w:spacing w:after="40" w:before="40"/>
+              <w:spacing w:before="40" w:after="40" w:line="245" w:lineRule="auto"/>
+              <w:jc w:val="center"/>
             </w:pPr>
             <w:r>
               <w:rPr>
                 <w:b w:val="0"/>
                 <w:color w:val="000000"/>
-                <w:sz w:val="20"/>
+                <w:sz w:val="21"/>
               </w:rPr>
-              <w:t>5</w:t>
+              <w:t>Aprobado</w:t>
             </w:r>
           </w:p>
         </w:tc>
@@ -1361,76 +1740,82 @@
         </w:trPr>
         <w:tc>
           <w:tcPr>
-            <w:tcW w:type="dxa" w:w="6048"/>
-            <w:shd w:fill="F2F2F2"/>
+            <w:tcW w:type="dxa" w:w="2304"/>
+            <w:vAlign w:val="center"/>
+            <w:shd w:fill="F3F3F3"/>
             <w:tcMar>
-              <w:top w:w="90" w:type="dxa"/>
-              <w:bottom w:w="90" w:type="dxa"/>
-              <w:left w:w="90" w:type="dxa"/>
-              <w:right w:w="90" w:type="dxa"/>
+              <w:top w:w="95" w:type="dxa"/>
+              <w:bottom w:w="95" w:type="dxa"/>
+              <w:left w:w="95" w:type="dxa"/>
+              <w:right w:w="95" w:type="dxa"/>
             </w:tcMar>
           </w:tcPr>
           <w:p>
             <w:pPr>
-              <w:spacing w:after="40" w:before="40"/>
+              <w:spacing w:before="40" w:after="40" w:line="245" w:lineRule="auto"/>
+              <w:jc w:val="left"/>
             </w:pPr>
             <w:r>
               <w:rPr>
                 <w:b w:val="0"/>
                 <w:color w:val="000000"/>
-                <w:sz w:val="20"/>
+                <w:sz w:val="21"/>
               </w:rPr>
-              <w:t>context</w:t>
+              <w:t>6 · Búsqueda de catálogo</w:t>
             </w:r>
           </w:p>
         </w:tc>
         <w:tc>
           <w:tcPr>
-            <w:tcW w:type="dxa" w:w="1872"/>
-            <w:shd w:fill="F2F2F2"/>
+            <w:tcW w:type="dxa" w:w="6192"/>
+            <w:vAlign w:val="center"/>
+            <w:shd w:fill="F3F3F3"/>
             <w:tcMar>
-              <w:top w:w="90" w:type="dxa"/>
-              <w:bottom w:w="90" w:type="dxa"/>
-              <w:left w:w="90" w:type="dxa"/>
-              <w:right w:w="90" w:type="dxa"/>
+              <w:top w:w="95" w:type="dxa"/>
+              <w:bottom w:w="95" w:type="dxa"/>
+              <w:left w:w="95" w:type="dxa"/>
+              <w:right w:w="95" w:type="dxa"/>
             </w:tcMar>
           </w:tcPr>
           <w:p>
             <w:pPr>
-              <w:spacing w:after="40" w:before="40"/>
+              <w:spacing w:before="40" w:after="40" w:line="245" w:lineRule="auto"/>
+              <w:jc w:val="left"/>
             </w:pPr>
             <w:r>
               <w:rPr>
                 <w:b w:val="0"/>
                 <w:color w:val="000000"/>
-                <w:sz w:val="20"/>
+                <w:sz w:val="21"/>
               </w:rPr>
-              <w:t>3</w:t>
+              <w:t>La escritura en el buscador muestra coincidencias y retira productos ajenos al criterio.</w:t>
             </w:r>
           </w:p>
         </w:tc>
         <w:tc>
           <w:tcPr>
-            <w:tcW w:type="dxa" w:w="1872"/>
-            <w:shd w:fill="F2F2F2"/>
+            <w:tcW w:type="dxa" w:w="1296"/>
+            <w:vAlign w:val="center"/>
+            <w:shd w:fill="F3F3F3"/>
             <w:tcMar>
-              <w:top w:w="90" w:type="dxa"/>
-              <w:bottom w:w="90" w:type="dxa"/>
-              <w:left w:w="90" w:type="dxa"/>
-              <w:right w:w="90" w:type="dxa"/>
+              <w:top w:w="95" w:type="dxa"/>
+              <w:bottom w:w="95" w:type="dxa"/>
+              <w:left w:w="95" w:type="dxa"/>
+              <w:right w:w="95" w:type="dxa"/>
             </w:tcMar>
           </w:tcPr>
           <w:p>
             <w:pPr>
-              <w:spacing w:after="40" w:before="40"/>
+              <w:spacing w:before="40" w:after="40" w:line="245" w:lineRule="auto"/>
+              <w:jc w:val="center"/>
             </w:pPr>
             <w:r>
               <w:rPr>
                 <w:b w:val="0"/>
                 <w:color w:val="000000"/>
-                <w:sz w:val="20"/>
+                <w:sz w:val="21"/>
               </w:rPr>
-              <w:t>27</w:t>
+              <w:t>Aprobado</w:t>
             </w:r>
           </w:p>
         </w:tc>
@@ -1441,76 +1826,82 @@
         </w:trPr>
         <w:tc>
           <w:tcPr>
-            <w:tcW w:type="dxa" w:w="6048"/>
+            <w:tcW w:type="dxa" w:w="2304"/>
+            <w:vAlign w:val="center"/>
             <w:shd w:fill="FFFFFF"/>
             <w:tcMar>
-              <w:top w:w="90" w:type="dxa"/>
-              <w:bottom w:w="90" w:type="dxa"/>
-              <w:left w:w="90" w:type="dxa"/>
-              <w:right w:w="90" w:type="dxa"/>
+              <w:top w:w="95" w:type="dxa"/>
+              <w:bottom w:w="95" w:type="dxa"/>
+              <w:left w:w="95" w:type="dxa"/>
+              <w:right w:w="95" w:type="dxa"/>
             </w:tcMar>
           </w:tcPr>
           <w:p>
             <w:pPr>
-              <w:spacing w:after="40" w:before="40"/>
+              <w:spacing w:before="40" w:after="40" w:line="245" w:lineRule="auto"/>
+              <w:jc w:val="left"/>
             </w:pPr>
             <w:r>
               <w:rPr>
                 <w:b w:val="0"/>
                 <w:color w:val="000000"/>
-                <w:sz w:val="20"/>
+                <w:sz w:val="21"/>
               </w:rPr>
-              <w:t>pages</w:t>
+              <w:t>7 · Menú móvil</w:t>
             </w:r>
           </w:p>
         </w:tc>
         <w:tc>
           <w:tcPr>
-            <w:tcW w:type="dxa" w:w="1872"/>
+            <w:tcW w:type="dxa" w:w="6192"/>
+            <w:vAlign w:val="center"/>
             <w:shd w:fill="FFFFFF"/>
             <w:tcMar>
-              <w:top w:w="90" w:type="dxa"/>
-              <w:bottom w:w="90" w:type="dxa"/>
-              <w:left w:w="90" w:type="dxa"/>
-              <w:right w:w="90" w:type="dxa"/>
+              <w:top w:w="95" w:type="dxa"/>
+              <w:bottom w:w="95" w:type="dxa"/>
+              <w:left w:w="95" w:type="dxa"/>
+              <w:right w:w="95" w:type="dxa"/>
             </w:tcMar>
           </w:tcPr>
           <w:p>
             <w:pPr>
-              <w:spacing w:after="40" w:before="40"/>
+              <w:spacing w:before="40" w:after="40" w:line="245" w:lineRule="auto"/>
+              <w:jc w:val="left"/>
             </w:pPr>
             <w:r>
               <w:rPr>
                 <w:b w:val="0"/>
                 <w:color w:val="000000"/>
-                <w:sz w:val="20"/>
+                <w:sz w:val="21"/>
               </w:rPr>
-              <w:t>8</w:t>
+              <w:t>La apertura y el cierre actualizan el estado accesible; la navegación cierra el menú.</w:t>
             </w:r>
           </w:p>
         </w:tc>
         <w:tc>
           <w:tcPr>
-            <w:tcW w:type="dxa" w:w="1872"/>
+            <w:tcW w:type="dxa" w:w="1296"/>
+            <w:vAlign w:val="center"/>
             <w:shd w:fill="FFFFFF"/>
             <w:tcMar>
-              <w:top w:w="90" w:type="dxa"/>
-              <w:bottom w:w="90" w:type="dxa"/>
-              <w:left w:w="90" w:type="dxa"/>
-              <w:right w:w="90" w:type="dxa"/>
+              <w:top w:w="95" w:type="dxa"/>
+              <w:bottom w:w="95" w:type="dxa"/>
+              <w:left w:w="95" w:type="dxa"/>
+              <w:right w:w="95" w:type="dxa"/>
             </w:tcMar>
           </w:tcPr>
           <w:p>
             <w:pPr>
-              <w:spacing w:after="40" w:before="40"/>
+              <w:spacing w:before="40" w:after="40" w:line="245" w:lineRule="auto"/>
+              <w:jc w:val="center"/>
             </w:pPr>
             <w:r>
               <w:rPr>
                 <w:b w:val="0"/>
                 <w:color w:val="000000"/>
-                <w:sz w:val="20"/>
+                <w:sz w:val="21"/>
               </w:rPr>
-              <w:t>35</w:t>
+              <w:t>Aprobado</w:t>
             </w:r>
           </w:p>
         </w:tc>
@@ -1521,76 +1912,82 @@
         </w:trPr>
         <w:tc>
           <w:tcPr>
-            <w:tcW w:type="dxa" w:w="6048"/>
-            <w:shd w:fill="F2F2F2"/>
+            <w:tcW w:type="dxa" w:w="2304"/>
+            <w:vAlign w:val="center"/>
+            <w:shd w:fill="F3F3F3"/>
             <w:tcMar>
-              <w:top w:w="90" w:type="dxa"/>
-              <w:bottom w:w="90" w:type="dxa"/>
-              <w:left w:w="90" w:type="dxa"/>
-              <w:right w:w="90" w:type="dxa"/>
+              <w:top w:w="95" w:type="dxa"/>
+              <w:bottom w:w="95" w:type="dxa"/>
+              <w:left w:w="95" w:type="dxa"/>
+              <w:right w:w="95" w:type="dxa"/>
             </w:tcMar>
           </w:tcPr>
           <w:p>
             <w:pPr>
-              <w:spacing w:after="40" w:before="40"/>
+              <w:spacing w:before="40" w:after="40" w:line="245" w:lineRule="auto"/>
+              <w:jc w:val="left"/>
             </w:pPr>
             <w:r>
               <w:rPr>
                 <w:b w:val="0"/>
                 <w:color w:val="000000"/>
-                <w:sz w:val="20"/>
+                <w:sz w:val="21"/>
               </w:rPr>
-              <w:t>routes</w:t>
+              <w:t>8 · Región y comuna</w:t>
             </w:r>
           </w:p>
         </w:tc>
         <w:tc>
           <w:tcPr>
-            <w:tcW w:type="dxa" w:w="1872"/>
-            <w:shd w:fill="F2F2F2"/>
+            <w:tcW w:type="dxa" w:w="6192"/>
+            <w:vAlign w:val="center"/>
+            <w:shd w:fill="F3F3F3"/>
             <w:tcMar>
-              <w:top w:w="90" w:type="dxa"/>
-              <w:bottom w:w="90" w:type="dxa"/>
-              <w:left w:w="90" w:type="dxa"/>
-              <w:right w:w="90" w:type="dxa"/>
+              <w:top w:w="95" w:type="dxa"/>
+              <w:bottom w:w="95" w:type="dxa"/>
+              <w:left w:w="95" w:type="dxa"/>
+              <w:right w:w="95" w:type="dxa"/>
             </w:tcMar>
           </w:tcPr>
           <w:p>
             <w:pPr>
-              <w:spacing w:after="40" w:before="40"/>
+              <w:spacing w:before="40" w:after="40" w:line="245" w:lineRule="auto"/>
+              <w:jc w:val="left"/>
             </w:pPr>
             <w:r>
               <w:rPr>
                 <w:b w:val="0"/>
                 <w:color w:val="000000"/>
-                <w:sz w:val="20"/>
+                <w:sz w:val="21"/>
               </w:rPr>
-              <w:t>1</w:t>
+              <w:t>Cambiar la región reinicia la comuna y limita las opciones a la nueva selección.</w:t>
             </w:r>
           </w:p>
         </w:tc>
         <w:tc>
           <w:tcPr>
-            <w:tcW w:type="dxa" w:w="1872"/>
-            <w:shd w:fill="F2F2F2"/>
+            <w:tcW w:type="dxa" w:w="1296"/>
+            <w:vAlign w:val="center"/>
+            <w:shd w:fill="F3F3F3"/>
             <w:tcMar>
-              <w:top w:w="90" w:type="dxa"/>
-              <w:bottom w:w="90" w:type="dxa"/>
-              <w:left w:w="90" w:type="dxa"/>
-              <w:right w:w="90" w:type="dxa"/>
+              <w:top w:w="95" w:type="dxa"/>
+              <w:bottom w:w="95" w:type="dxa"/>
+              <w:left w:w="95" w:type="dxa"/>
+              <w:right w:w="95" w:type="dxa"/>
             </w:tcMar>
           </w:tcPr>
           <w:p>
             <w:pPr>
-              <w:spacing w:after="40" w:before="40"/>
+              <w:spacing w:before="40" w:after="40" w:line="245" w:lineRule="auto"/>
+              <w:jc w:val="center"/>
             </w:pPr>
             <w:r>
               <w:rPr>
                 <w:b w:val="0"/>
                 <w:color w:val="000000"/>
-                <w:sz w:val="20"/>
+                <w:sz w:val="21"/>
               </w:rPr>
-              <w:t>15</w:t>
+              <w:t>Aprobado</w:t>
             </w:r>
           </w:p>
         </w:tc>
@@ -1601,76 +1998,82 @@
         </w:trPr>
         <w:tc>
           <w:tcPr>
-            <w:tcW w:type="dxa" w:w="6048"/>
+            <w:tcW w:type="dxa" w:w="2304"/>
+            <w:vAlign w:val="center"/>
             <w:shd w:fill="FFFFFF"/>
             <w:tcMar>
-              <w:top w:w="90" w:type="dxa"/>
-              <w:bottom w:w="90" w:type="dxa"/>
-              <w:left w:w="90" w:type="dxa"/>
-              <w:right w:w="90" w:type="dxa"/>
+              <w:top w:w="95" w:type="dxa"/>
+              <w:bottom w:w="95" w:type="dxa"/>
+              <w:left w:w="95" w:type="dxa"/>
+              <w:right w:w="95" w:type="dxa"/>
             </w:tcMar>
           </w:tcPr>
           <w:p>
             <w:pPr>
-              <w:spacing w:after="40" w:before="40"/>
+              <w:spacing w:before="40" w:after="40" w:line="245" w:lineRule="auto"/>
+              <w:jc w:val="left"/>
             </w:pPr>
             <w:r>
               <w:rPr>
                 <w:b w:val="0"/>
                 <w:color w:val="000000"/>
-                <w:sz w:val="20"/>
+                <w:sz w:val="21"/>
               </w:rPr>
-              <w:t>services</w:t>
+              <w:t>9 · Acceso protegido</w:t>
             </w:r>
           </w:p>
         </w:tc>
         <w:tc>
           <w:tcPr>
-            <w:tcW w:type="dxa" w:w="1872"/>
+            <w:tcW w:type="dxa" w:w="6192"/>
+            <w:vAlign w:val="center"/>
             <w:shd w:fill="FFFFFF"/>
             <w:tcMar>
-              <w:top w:w="90" w:type="dxa"/>
-              <w:bottom w:w="90" w:type="dxa"/>
-              <w:left w:w="90" w:type="dxa"/>
-              <w:right w:w="90" w:type="dxa"/>
+              <w:top w:w="95" w:type="dxa"/>
+              <w:bottom w:w="95" w:type="dxa"/>
+              <w:left w:w="95" w:type="dxa"/>
+              <w:right w:w="95" w:type="dxa"/>
             </w:tcMar>
           </w:tcPr>
           <w:p>
             <w:pPr>
-              <w:spacing w:after="40" w:before="40"/>
+              <w:spacing w:before="40" w:after="40" w:line="245" w:lineRule="auto"/>
+              <w:jc w:val="left"/>
             </w:pPr>
             <w:r>
               <w:rPr>
                 <w:b w:val="0"/>
                 <w:color w:val="000000"/>
-                <w:sz w:val="20"/>
+                <w:sz w:val="21"/>
               </w:rPr>
-              <w:t>6</w:t>
+              <w:t>Una visita sin sesión recibe acceso a autenticación y no monta el contenido privado.</w:t>
             </w:r>
           </w:p>
         </w:tc>
         <w:tc>
           <w:tcPr>
-            <w:tcW w:type="dxa" w:w="1872"/>
+            <w:tcW w:type="dxa" w:w="1296"/>
+            <w:vAlign w:val="center"/>
             <w:shd w:fill="FFFFFF"/>
             <w:tcMar>
-              <w:top w:w="90" w:type="dxa"/>
-              <w:bottom w:w="90" w:type="dxa"/>
-              <w:left w:w="90" w:type="dxa"/>
-              <w:right w:w="90" w:type="dxa"/>
+              <w:top w:w="95" w:type="dxa"/>
+              <w:bottom w:w="95" w:type="dxa"/>
+              <w:left w:w="95" w:type="dxa"/>
+              <w:right w:w="95" w:type="dxa"/>
             </w:tcMar>
           </w:tcPr>
           <w:p>
             <w:pPr>
-              <w:spacing w:after="40" w:before="40"/>
+              <w:spacing w:before="40" w:after="40" w:line="245" w:lineRule="auto"/>
+              <w:jc w:val="center"/>
             </w:pPr>
             <w:r>
               <w:rPr>
                 <w:b w:val="0"/>
                 <w:color w:val="000000"/>
-                <w:sz w:val="20"/>
+                <w:sz w:val="21"/>
               </w:rPr>
-              <w:t>115</w:t>
+              <w:t>Aprobado</w:t>
             </w:r>
           </w:p>
         </w:tc>
@@ -1681,76 +2084,82 @@
         </w:trPr>
         <w:tc>
           <w:tcPr>
-            <w:tcW w:type="dxa" w:w="6048"/>
-            <w:shd w:fill="F2F2F2"/>
+            <w:tcW w:type="dxa" w:w="2304"/>
+            <w:vAlign w:val="center"/>
+            <w:shd w:fill="F3F3F3"/>
             <w:tcMar>
-              <w:top w:w="90" w:type="dxa"/>
-              <w:bottom w:w="90" w:type="dxa"/>
-              <w:left w:w="90" w:type="dxa"/>
-              <w:right w:w="90" w:type="dxa"/>
+              <w:top w:w="95" w:type="dxa"/>
+              <w:bottom w:w="95" w:type="dxa"/>
+              <w:left w:w="95" w:type="dxa"/>
+              <w:right w:w="95" w:type="dxa"/>
             </w:tcMar>
           </w:tcPr>
           <w:p>
             <w:pPr>
-              <w:spacing w:after="40" w:before="40"/>
+              <w:spacing w:before="40" w:after="40" w:line="245" w:lineRule="auto"/>
+              <w:jc w:val="left"/>
             </w:pPr>
             <w:r>
               <w:rPr>
                 <w:b w:val="0"/>
                 <w:color w:val="000000"/>
-                <w:sz w:val="20"/>
+                <w:sz w:val="21"/>
               </w:rPr>
-              <w:t>utils</w:t>
+              <w:t>10 · Fallo de almacenamiento</w:t>
             </w:r>
           </w:p>
         </w:tc>
         <w:tc>
           <w:tcPr>
-            <w:tcW w:type="dxa" w:w="1872"/>
-            <w:shd w:fill="F2F2F2"/>
+            <w:tcW w:type="dxa" w:w="6192"/>
+            <w:vAlign w:val="center"/>
+            <w:shd w:fill="F3F3F3"/>
             <w:tcMar>
-              <w:top w:w="90" w:type="dxa"/>
-              <w:bottom w:w="90" w:type="dxa"/>
-              <w:left w:w="90" w:type="dxa"/>
-              <w:right w:w="90" w:type="dxa"/>
+              <w:top w:w="95" w:type="dxa"/>
+              <w:bottom w:w="95" w:type="dxa"/>
+              <w:left w:w="95" w:type="dxa"/>
+              <w:right w:w="95" w:type="dxa"/>
             </w:tcMar>
           </w:tcPr>
           <w:p>
             <w:pPr>
-              <w:spacing w:after="40" w:before="40"/>
+              <w:spacing w:before="40" w:after="40" w:line="245" w:lineRule="auto"/>
+              <w:jc w:val="left"/>
             </w:pPr>
             <w:r>
               <w:rPr>
                 <w:b w:val="0"/>
                 <w:color w:val="000000"/>
-                <w:sz w:val="20"/>
+                <w:sz w:val="21"/>
               </w:rPr>
-              <w:t>10</w:t>
+              <w:t>Un error al guardar el perfil propio conserva los usuarios y revierte la sesión anterior.</w:t>
             </w:r>
           </w:p>
         </w:tc>
         <w:tc>
           <w:tcPr>
-            <w:tcW w:type="dxa" w:w="1872"/>
-            <w:shd w:fill="F2F2F2"/>
+            <w:tcW w:type="dxa" w:w="1296"/>
+            <w:vAlign w:val="center"/>
+            <w:shd w:fill="F3F3F3"/>
             <w:tcMar>
-              <w:top w:w="90" w:type="dxa"/>
-              <w:bottom w:w="90" w:type="dxa"/>
-              <w:left w:w="90" w:type="dxa"/>
-              <w:right w:w="90" w:type="dxa"/>
+              <w:top w:w="95" w:type="dxa"/>
+              <w:bottom w:w="95" w:type="dxa"/>
+              <w:left w:w="95" w:type="dxa"/>
+              <w:right w:w="95" w:type="dxa"/>
             </w:tcMar>
           </w:tcPr>
           <w:p>
             <w:pPr>
-              <w:spacing w:after="40" w:before="40"/>
+              <w:spacing w:before="40" w:after="40" w:line="245" w:lineRule="auto"/>
+              <w:jc w:val="center"/>
             </w:pPr>
             <w:r>
               <w:rPr>
                 <w:b w:val="0"/>
                 <w:color w:val="000000"/>
-                <w:sz w:val="20"/>
+                <w:sz w:val="21"/>
               </w:rPr>
-              <w:t>96</w:t>
+              <w:t>Aprobado</w:t>
             </w:r>
           </w:p>
         </w:tc>
@@ -1758,20 +2167,12 @@
     </w:tbl>
     <w:p>
       <w:pPr>
-        <w:pStyle w:val="Heading1"/>
+        <w:spacing w:after="40" w:before="0" w:line="40" w:lineRule="exact"/>
       </w:pPr>
       <w:r>
-        <w:t>Uso de mocks</w:t>
-      </w:r>
-    </w:p>
-    <w:p>
-      <w:r>
-        <w:t>vi.fn registra callbacks sin depender de efectos externos. Los spies de Storage.prototype fuerzan errores de lectura o escritura y verifican que la aplicación no borre información ni deje cambios parciales. Otros casos controlan Date para datos deterministas. Estos dobles se usan donde permiten observar un contrato o reproducir un fallo.</w:t>
-      </w:r>
-    </w:p>
-    <w:p>
-      <w:r>
-        <w:t>src/test/setup.js reemplaza scrollTo e implementa la apertura y cierre mínimos de dialog, capacidades que jsdom no reproduce como un navegador. Esto permite comprobar el estado DOM, pero no acredita desplazamiento real, foco nativo completo, diseño CSS ni reproducción multimedia.</w:t>
+        <w:rPr>
+          <w:sz w:val="4"/>
+        </w:rPr>
       </w:r>
     </w:p>
     <w:p>
@@ -1779,17 +2180,32 @@
         <w:pStyle w:val="Heading1"/>
       </w:pPr>
       <w:r>
-        <w:t>Cuándo ejecutar cada comprobación</w:t>
+        <w:t>Corrección de las imágenes del carrito</w:t>
       </w:r>
     </w:p>
     <w:p>
+      <w:pPr>
+        <w:widowControl/>
+      </w:pPr>
       <w:r>
-        <w:t>Durante una edición se seleccionan los archivos afectados. Una regresión completa se ejecuta al integrar cambios compartidos o cerrar una entrega; la cobertura se genera cuando se actualiza la evidencia. Este cierre no repite toda la suite por el ajuste exclusivo de CSS: usa compilación y revisión visual para ese cambio.</w:t>
+        <w:t>La verificación detectó que el carrito utilizaba un ícono fijo. La corrección incorporó el componente compartido de imágenes y ajustó la miniatura a su contenedor. Dos aserciones reprodujeron el fallo antes del cambio; después aprobaron los nueve casos relacionados y la regresión completa.</w:t>
       </w:r>
     </w:p>
     <w:p>
+      <w:pPr>
+        <w:widowControl/>
+      </w:pPr>
       <w:r>
-        <w:br w:type="page"/>
+        <w:t>La revisión de navegador confirmó la fotografía después de recargar, tanto en 1280 × 900 como en 390 × 844 píxeles, sin desbordamiento horizontal ni errores de consola en ese recorrido.</w:t>
+      </w:r>
+    </w:p>
+    <w:p>
+      <w:pPr>
+        <w:pStyle w:val="Heading1"/>
+        <w:pageBreakBefore/>
+      </w:pPr>
+      <w:r>
+        <w:t>Evaluación de resultados y límites</w:t>
       </w:r>
     </w:p>
     <w:p>
@@ -1797,162 +2213,23 @@
         <w:pStyle w:val="Heading1"/>
       </w:pPr>
       <w:r>
-        <w:t>Cinco casos de presentación y reglas</w:t>
-      </w:r>
-    </w:p>
-    <w:p>
-      <w:r>
-        <w:t>Los nombres siguientes corresponden a pruebas aprobadas en el corte. La guía de defensa incluye sus comandos individuales y sirve para explicar el comportamiento observado y el error que cada caso detecta.</w:t>
+        <w:t>Revisión funcional en navegador</w:t>
       </w:r>
     </w:p>
     <w:p>
       <w:pPr>
-        <w:pStyle w:val="Heading2"/>
+        <w:widowControl/>
       </w:pPr>
       <w:r>
-        <w:t>1 Props de producto</w:t>
+        <w:t>La revisión transversal cubrió 22 rutas y variantes de las 20 pantallas, en tres tamaños de pantalla. Las 66 comprobaciones no detectaron desbordamiento horizontal de página ni errores en imágenes que habían terminado de cargar. También se revisaron cinco destinos inexistentes, permisos por perfil, formularios, menú móvil y persistencia de carrito y rutina.</w:t>
       </w:r>
     </w:p>
     <w:p>
       <w:pPr>
-        <w:spacing w:after="60"/>
+        <w:widowControl/>
       </w:pPr>
       <w:r>
-        <w:rPr>
-          <w:sz w:val="18"/>
-        </w:rPr>
-        <w:t>src/components/molecules/ProductCard.test.jsx</w:t>
-      </w:r>
-    </w:p>
-    <w:p>
-      <w:r>
-        <w:t>Caso: «renderiza los datos principales recibidos mediante la prop product».</w:t>
-      </w:r>
-    </w:p>
-    <w:p>
-      <w:r>
-        <w:t>Se entrega un producto por props y se comprueban nombre, categoría y precio en el DOM. Detecta pérdida o presentación incorrecta de datos. No necesita un mock.</w:t>
-      </w:r>
-    </w:p>
-    <w:p>
-      <w:pPr>
-        <w:pStyle w:val="Heading2"/>
-      </w:pPr>
-      <w:r>
-        <w:t>2 Callback de agregar</w:t>
-      </w:r>
-    </w:p>
-    <w:p>
-      <w:pPr>
-        <w:spacing w:after="60"/>
-      </w:pPr>
-      <w:r>
-        <w:rPr>
-          <w:sz w:val="18"/>
-        </w:rPr>
-        <w:t>src/components/molecules/ProductCard.test.jsx</w:t>
-      </w:r>
-    </w:p>
-    <w:p>
-      <w:r>
-        <w:t>Caso: «entrega el producto al callback cuando se presiona Agregar».</w:t>
-      </w:r>
-    </w:p>
-    <w:p>
-      <w:r>
-        <w:t>userEvent pulsa Agregar y un vi.fn comprueba que recibe el objeto product. Detecta un evento desconectado o un argumento incorrecto; la persistencia se verifica en otros casos del carrito.</w:t>
-      </w:r>
-    </w:p>
-    <w:p>
-      <w:pPr>
-        <w:pStyle w:val="Heading2"/>
-      </w:pPr>
-      <w:r>
-        <w:t>3 Producto agotado</w:t>
-      </w:r>
-    </w:p>
-    <w:p>
-      <w:pPr>
-        <w:spacing w:after="60"/>
-      </w:pPr>
-      <w:r>
-        <w:rPr>
-          <w:sz w:val="18"/>
-        </w:rPr>
-        <w:t>src/components/atoms/StockBadge.test.jsx</w:t>
-      </w:r>
-    </w:p>
-    <w:p>
-      <w:r>
-        <w:t>Caso: «muestra Sin stock cuando no quedan unidades».</w:t>
-      </w:r>
-    </w:p>
-    <w:p>
-      <w:r>
-        <w:t>Se renderiza stock 0 con nivel crítico 5 y se espera Sin stock. Comprueba la precedencia del agotamiento frente al estado crítico.</w:t>
-      </w:r>
-    </w:p>
-    <w:p>
-      <w:pPr>
-        <w:pStyle w:val="Heading2"/>
-      </w:pPr>
-      <w:r>
-        <w:t>4 Controles bloqueados</w:t>
-      </w:r>
-    </w:p>
-    <w:p>
-      <w:pPr>
-        <w:spacing w:after="60"/>
-      </w:pPr>
-      <w:r>
-        <w:rPr>
-          <w:sz w:val="18"/>
-        </w:rPr>
-        <w:t>src/components/molecules/QuantitySelector.test.jsx</w:t>
-      </w:r>
-    </w:p>
-    <w:p>
-      <w:r>
-        <w:t>Caso: «permite bloquear ambos límites sin ejecutar los callbacks».</w:t>
-      </w:r>
-    </w:p>
-    <w:p>
-      <w:r>
-        <w:t>Con ambos límites deshabilitados se intenta aumentar y disminuir. Dos mocks verifican que ningún callback se ejecuta. La regla numérica de stock se prueba además en cart.test.js.</w:t>
-      </w:r>
-    </w:p>
-    <w:p>
-      <w:pPr>
-        <w:pStyle w:val="Heading2"/>
-      </w:pPr>
-      <w:r>
-        <w:t>5 Despacho gratuito</w:t>
-      </w:r>
-    </w:p>
-    <w:p>
-      <w:pPr>
-        <w:spacing w:after="60"/>
-      </w:pPr>
-      <w:r>
-        <w:rPr>
-          <w:sz w:val="18"/>
-        </w:rPr>
-        <w:t>src/utils/cart.test.js</w:t>
-      </w:r>
-    </w:p>
-    <w:p>
-      <w:r>
-        <w:t>Caso: «calcula despacho gratuito desde $50.000».</w:t>
-      </w:r>
-    </w:p>
-    <w:p>
-      <w:r>
-        <w:t>Dos unidades de $39.990 producen despacho $0 y total $79.980. Es una prueba de función pura; este caso comprueba un subtotal sobre el umbral, no una medición de rendimiento ni el valor límite exacto.</w:t>
-      </w:r>
-    </w:p>
-    <w:p>
-      <w:r>
-        <w:br w:type="page"/>
+        <w:t>La revisión administrativa comprobó creación, edición y eliminación de un producto de prueba, incluida la cancelación previa del borrado. La aplicación conservó compra y rutina al recargar y cerrar sesión. Estas observaciones corresponden a los estados recorridos en un navegador basado en Chromium.</w:t>
       </w:r>
     </w:p>
     <w:p>
@@ -1960,206 +2237,7 @@
         <w:pStyle w:val="Heading1"/>
       </w:pPr>
       <w:r>
-        <w:t>Cinco casos de interacción y recuperación</w:t>
-      </w:r>
-    </w:p>
-    <w:p>
-      <w:r>
-        <w:t>Los nombres siguientes corresponden a pruebas aprobadas en el corte. La guía de defensa incluye sus comandos individuales y sirve para explicar el comportamiento observado y el error que cada caso detecta.</w:t>
-      </w:r>
-    </w:p>
-    <w:p>
-      <w:pPr>
-        <w:pStyle w:val="Heading2"/>
-      </w:pPr>
-      <w:r>
-        <w:t>6 Búsqueda del catálogo</w:t>
-      </w:r>
-    </w:p>
-    <w:p>
-      <w:pPr>
-        <w:spacing w:after="60"/>
-      </w:pPr>
-      <w:r>
-        <w:rPr>
-          <w:sz w:val="18"/>
-        </w:rPr>
-        <w:t>src/pages/ProductsPage.test.jsx</w:t>
-      </w:r>
-    </w:p>
-    <w:p>
-      <w:r>
-        <w:t>Caso: «filtra el catálogo al escribir en el buscador».</w:t>
-      </w:r>
-    </w:p>
-    <w:p>
-      <w:r>
-        <w:t>Se escribe en el buscador y se comprueba la presencia del producto coincidente y la ausencia de otros productos. Detecta filtros que no actualizan el DOM.</w:t>
-      </w:r>
-    </w:p>
-    <w:p>
-      <w:pPr>
-        <w:pStyle w:val="Heading2"/>
-      </w:pPr>
-      <w:r>
-        <w:t>7 Estado del menú móvil</w:t>
-      </w:r>
-    </w:p>
-    <w:p>
-      <w:pPr>
-        <w:spacing w:after="60"/>
-      </w:pPr>
-      <w:r>
-        <w:rPr>
-          <w:sz w:val="18"/>
-        </w:rPr>
-        <w:t>src/components/organisms/Navbar.test.jsx</w:t>
-      </w:r>
-    </w:p>
-    <w:p>
-      <w:r>
-        <w:t>Caso: «abre y cierra el menú móvil y lo cierra al navegar».</w:t>
-      </w:r>
-    </w:p>
-    <w:p>
-      <w:r>
-        <w:t>Los clics alternan aria-expanded y la clase show; al ir a Tienda el menú se cierra y el enlace queda activo. jsdom verifica estado y atributos; la apariencia se revisa en navegador.</w:t>
-      </w:r>
-    </w:p>
-    <w:p>
-      <w:pPr>
-        <w:pStyle w:val="Heading2"/>
-      </w:pPr>
-      <w:r>
-        <w:t>8 Región y comuna</w:t>
-      </w:r>
-    </w:p>
-    <w:p>
-      <w:pPr>
-        <w:spacing w:after="60"/>
-      </w:pPr>
-      <w:r>
-        <w:rPr>
-          <w:sz w:val="18"/>
-        </w:rPr>
-        <w:t>src/components/organisms/RegistrationForm.test.jsx</w:t>
-      </w:r>
-    </w:p>
-    <w:p>
-      <w:r>
-        <w:t>Caso: «habilita comunas de la región y reinicia la selección al cambiarla».</w:t>
-      </w:r>
-    </w:p>
-    <w:p>
-      <w:r>
-        <w:t>La comuna inicia deshabilitada. Tras elegir Santiago y cambiar a Valparaíso se vacía el valor, desaparece Santiago y aparece Viña del Mar. Evita conservar una comuna incompatible.</w:t>
-      </w:r>
-    </w:p>
-    <w:p>
-      <w:pPr>
-        <w:pStyle w:val="Heading2"/>
-      </w:pPr>
-      <w:r>
-        <w:t>9 Guarda de acceso</w:t>
-      </w:r>
-    </w:p>
-    <w:p>
-      <w:pPr>
-        <w:spacing w:after="60"/>
-      </w:pPr>
-      <w:r>
-        <w:rPr>
-          <w:sz w:val="18"/>
-        </w:rPr>
-        <w:t>src/routes/ProtectedRoute.test.jsx</w:t>
-      </w:r>
-    </w:p>
-    <w:p>
-      <w:r>
-        <w:t>Caso: «no monta contenido privado para un visitante y conserva ruta y filtros para Login».</w:t>
-      </w:r>
-    </w:p>
-    <w:p>
-      <w:r>
-        <w:t>Sin sesión se muestra Login, se preservan pathname y search y no aparece el contenido privado. Un mock de montaje confirma que el componente protegido no se montó.</w:t>
-      </w:r>
-    </w:p>
-    <w:p>
-      <w:pPr>
-        <w:pStyle w:val="Heading2"/>
-      </w:pPr>
-      <w:r>
-        <w:t>10 Recuperación de almacenamiento</w:t>
-      </w:r>
-    </w:p>
-    <w:p>
-      <w:pPr>
-        <w:spacing w:after="60"/>
-      </w:pPr>
-      <w:r>
-        <w:rPr>
-          <w:sz w:val="18"/>
-        </w:rPr>
-        <w:t>src/services/adminUsers.test.js</w:t>
-      </w:r>
-    </w:p>
-    <w:p>
-      <w:r>
-        <w:t>Caso: «revierte la sesión si falla guardar el perfil propio».</w:t>
-      </w:r>
-    </w:p>
-    <w:p>
-      <w:r>
-        <w:t>Un spy de Storage.prototype.setItem lanza una DOMException al escribir usuarios. Se espera código STORAGE, usuarios originales y sesión anterior. Detecta un perfil o una sesión parcialmente actualizados.</w:t>
-      </w:r>
-    </w:p>
-    <w:p>
-      <w:r>
-        <w:br w:type="page"/>
-      </w:r>
-    </w:p>
-    <w:p>
-      <w:pPr>
-        <w:pStyle w:val="Heading1"/>
-      </w:pPr>
-      <w:r>
-        <w:t>Revisión en navegador y riesgos residuales</w:t>
-      </w:r>
-    </w:p>
-    <w:p>
-      <w:r>
-        <w:t>Se revisaron 22 rutas y variantes que cubren las 20 pantallas originales, en 390 × 844, 768 × 1024 y 1280 × 800. Las 66 mediciones registraron un main y un h1, sin desbordamiento horizontal de la página ni imágenes cargadas con error. Las tablas conservan su desplazamiento interno. La evidencia corresponde al navegador integrado basado en Chromium y a los estados recorridos.</w:t>
-      </w:r>
-    </w:p>
-    <w:p>
-      <w:r>
-        <w:t>Además se comprobaron acceso directo, cinco rutas inexistentes, menú móvil, registro y errores de formularios, contacto local, carrito persistente, rutina editable y cambio de roles. El carrito conservó tres unidades de creatina con despacho gratuito; la rutina conservó un ejercicio y cinco series después de recargar y cerrar sesión.</w:t>
-      </w:r>
-    </w:p>
-    <w:p>
-      <w:r>
-        <w:t>La administración permitió crear, editar y eliminar un producto de prueba, con cancelación previa de la eliminación. Vendedor accedió a consultas y no a formularios restringidos; Cliente volvió a la tienda; una visita anónima fue dirigida a Login. No se registraron errores ni advertencias en la consola de la aplicación durante los recorridos revisados.</w:t>
-      </w:r>
-    </w:p>
-    <w:p>
-      <w:pPr>
-        <w:pStyle w:val="Heading1"/>
-      </w:pPr>
-      <w:r>
-        <w:t>Corrección visual</w:t>
-      </w:r>
-    </w:p>
-    <w:p>
-      <w:r>
-        <w:t>La etiqueta de stock se dividía en varias líneas dentro de la tabla móvil de productos. El commit 55f03c3 aplica white-space: nowrap a esa etiqueta, conservando el diseño de KYNEX y el desplazamiento de la tabla. Se verificó el resultado sobre el build de producción.</w:t>
-      </w:r>
-    </w:p>
-    <w:p>
-      <w:pPr>
-        <w:pStyle w:val="Heading1"/>
-      </w:pPr>
-      <w:r>
-        <w:t>Código que no se ejecutó en esta medición</w:t>
+        <w:t>Riesgos residuales</w:t>
       </w:r>
     </w:p>
     <w:tbl>
@@ -2177,9 +2255,9 @@
         </w:tblBorders>
       </w:tblPr>
       <w:tblGrid>
-        <w:gridCol w:w="2160"/>
-        <w:gridCol w:w="2376"/>
-        <w:gridCol w:w="5256"/>
+        <w:gridCol w:w="2448"/>
+        <w:gridCol w:w="2592"/>
+        <w:gridCol w:w="5040"/>
       </w:tblGrid>
       <w:tr>
         <w:trPr>
@@ -2188,24 +2266,26 @@
         </w:trPr>
         <w:tc>
           <w:tcPr>
-            <w:tcW w:type="dxa" w:w="2160"/>
+            <w:tcW w:type="dxa" w:w="2448"/>
+            <w:vAlign w:val="center"/>
             <w:shd w:fill="333333"/>
             <w:tcMar>
-              <w:top w:w="90" w:type="dxa"/>
-              <w:bottom w:w="90" w:type="dxa"/>
-              <w:left w:w="90" w:type="dxa"/>
-              <w:right w:w="90" w:type="dxa"/>
+              <w:top w:w="95" w:type="dxa"/>
+              <w:bottom w:w="95" w:type="dxa"/>
+              <w:left w:w="95" w:type="dxa"/>
+              <w:right w:w="95" w:type="dxa"/>
             </w:tcMar>
           </w:tcPr>
           <w:p>
             <w:pPr>
-              <w:spacing w:after="40" w:before="40"/>
+              <w:spacing w:before="40" w:after="40" w:line="245" w:lineRule="auto"/>
+              <w:jc w:val="left"/>
             </w:pPr>
             <w:r>
               <w:rPr>
                 <w:b/>
                 <w:color w:val="FFFFFF"/>
-                <w:sz w:val="20"/>
+                <w:sz w:val="21"/>
               </w:rPr>
               <w:t>Zona</w:t>
             </w:r>
@@ -2213,51 +2293,55 @@
         </w:tc>
         <w:tc>
           <w:tcPr>
-            <w:tcW w:type="dxa" w:w="2376"/>
+            <w:tcW w:type="dxa" w:w="2592"/>
+            <w:vAlign w:val="center"/>
             <w:shd w:fill="333333"/>
             <w:tcMar>
-              <w:top w:w="90" w:type="dxa"/>
-              <w:bottom w:w="90" w:type="dxa"/>
-              <w:left w:w="90" w:type="dxa"/>
-              <w:right w:w="90" w:type="dxa"/>
+              <w:top w:w="95" w:type="dxa"/>
+              <w:bottom w:w="95" w:type="dxa"/>
+              <w:left w:w="95" w:type="dxa"/>
+              <w:right w:w="95" w:type="dxa"/>
             </w:tcMar>
           </w:tcPr>
           <w:p>
             <w:pPr>
-              <w:spacing w:after="40" w:before="40"/>
+              <w:spacing w:before="40" w:after="40" w:line="245" w:lineRule="auto"/>
+              <w:jc w:val="center"/>
             </w:pPr>
             <w:r>
               <w:rPr>
                 <w:b/>
                 <w:color w:val="FFFFFF"/>
-                <w:sz w:val="20"/>
+                <w:sz w:val="21"/>
               </w:rPr>
-              <w:t>Cobertura relevante</w:t>
+              <w:t>Cobertura de ramas</w:t>
             </w:r>
           </w:p>
         </w:tc>
         <w:tc>
           <w:tcPr>
-            <w:tcW w:type="dxa" w:w="5256"/>
+            <w:tcW w:type="dxa" w:w="5040"/>
+            <w:vAlign w:val="center"/>
             <w:shd w:fill="333333"/>
             <w:tcMar>
-              <w:top w:w="90" w:type="dxa"/>
-              <w:bottom w:w="90" w:type="dxa"/>
-              <w:left w:w="90" w:type="dxa"/>
-              <w:right w:w="90" w:type="dxa"/>
+              <w:top w:w="95" w:type="dxa"/>
+              <w:bottom w:w="95" w:type="dxa"/>
+              <w:left w:w="95" w:type="dxa"/>
+              <w:right w:w="95" w:type="dxa"/>
             </w:tcMar>
           </w:tcPr>
           <w:p>
             <w:pPr>
-              <w:spacing w:after="40" w:before="40"/>
+              <w:spacing w:before="40" w:after="40" w:line="245" w:lineRule="auto"/>
+              <w:jc w:val="left"/>
             </w:pPr>
             <w:r>
               <w:rPr>
                 <w:b/>
                 <w:color w:val="FFFFFF"/>
-                <w:sz w:val="20"/>
+                <w:sz w:val="21"/>
               </w:rPr>
-              <w:t>Lectura del riesgo</w:t>
+              <w:t>Aspecto pendiente</w:t>
             </w:r>
           </w:p>
         </w:tc>
@@ -2268,76 +2352,82 @@
         </w:trPr>
         <w:tc>
           <w:tcPr>
-            <w:tcW w:type="dxa" w:w="2160"/>
+            <w:tcW w:type="dxa" w:w="2448"/>
+            <w:vAlign w:val="center"/>
             <w:shd w:fill="FFFFFF"/>
             <w:tcMar>
-              <w:top w:w="90" w:type="dxa"/>
-              <w:bottom w:w="90" w:type="dxa"/>
-              <w:left w:w="90" w:type="dxa"/>
-              <w:right w:w="90" w:type="dxa"/>
+              <w:top w:w="95" w:type="dxa"/>
+              <w:bottom w:w="95" w:type="dxa"/>
+              <w:left w:w="95" w:type="dxa"/>
+              <w:right w:w="95" w:type="dxa"/>
             </w:tcMar>
           </w:tcPr>
           <w:p>
             <w:pPr>
-              <w:spacing w:after="40" w:before="40"/>
+              <w:spacing w:before="40" w:after="40" w:line="245" w:lineRule="auto"/>
+              <w:jc w:val="left"/>
             </w:pPr>
             <w:r>
               <w:rPr>
                 <w:b w:val="0"/>
                 <w:color w:val="000000"/>
-                <w:sz w:val="20"/>
+                <w:sz w:val="21"/>
               </w:rPr>
-              <w:t>Utilidades del carrito</w:t>
+              <w:t>Reglas del carrito</w:t>
             </w:r>
           </w:p>
         </w:tc>
         <w:tc>
           <w:tcPr>
-            <w:tcW w:type="dxa" w:w="2376"/>
+            <w:tcW w:type="dxa" w:w="2592"/>
+            <w:vAlign w:val="center"/>
             <w:shd w:fill="FFFFFF"/>
             <w:tcMar>
-              <w:top w:w="90" w:type="dxa"/>
-              <w:bottom w:w="90" w:type="dxa"/>
-              <w:left w:w="90" w:type="dxa"/>
-              <w:right w:w="90" w:type="dxa"/>
+              <w:top w:w="95" w:type="dxa"/>
+              <w:bottom w:w="95" w:type="dxa"/>
+              <w:left w:w="95" w:type="dxa"/>
+              <w:right w:w="95" w:type="dxa"/>
             </w:tcMar>
           </w:tcPr>
           <w:p>
             <w:pPr>
-              <w:spacing w:after="40" w:before="40"/>
+              <w:spacing w:before="40" w:after="40" w:line="245" w:lineRule="auto"/>
+              <w:jc w:val="center"/>
             </w:pPr>
             <w:r>
               <w:rPr>
                 <w:b w:val="0"/>
                 <w:color w:val="000000"/>
-                <w:sz w:val="20"/>
+                <w:sz w:val="21"/>
               </w:rPr>
-              <w:t>68,18% de ramas</w:t>
+              <w:t>68,18%</w:t>
             </w:r>
           </w:p>
         </w:tc>
         <w:tc>
           <w:tcPr>
-            <w:tcW w:type="dxa" w:w="5256"/>
+            <w:tcW w:type="dxa" w:w="5040"/>
+            <w:vAlign w:val="center"/>
             <w:shd w:fill="FFFFFF"/>
             <w:tcMar>
-              <w:top w:w="90" w:type="dxa"/>
-              <w:bottom w:w="90" w:type="dxa"/>
-              <w:left w:w="90" w:type="dxa"/>
-              <w:right w:w="90" w:type="dxa"/>
+              <w:top w:w="95" w:type="dxa"/>
+              <w:bottom w:w="95" w:type="dxa"/>
+              <w:left w:w="95" w:type="dxa"/>
+              <w:right w:w="95" w:type="dxa"/>
             </w:tcMar>
           </w:tcPr>
           <w:p>
             <w:pPr>
-              <w:spacing w:after="40" w:before="40"/>
+              <w:spacing w:before="40" w:after="40" w:line="245" w:lineRule="auto"/>
+              <w:jc w:val="left"/>
             </w:pPr>
             <w:r>
               <w:rPr>
                 <w:b w:val="0"/>
                 <w:color w:val="000000"/>
-                <w:sz w:val="20"/>
+                <w:sz w:val="21"/>
               </w:rPr>
-              <w:t>Quedan combinaciones alternativas de entradas y normalización.</w:t>
+              <w:t>Combinaciones alternativas de entradas y normalización.</w:t>
             </w:r>
           </w:p>
         </w:tc>
@@ -2348,76 +2438,82 @@
         </w:trPr>
         <w:tc>
           <w:tcPr>
-            <w:tcW w:type="dxa" w:w="2160"/>
-            <w:shd w:fill="F2F2F2"/>
+            <w:tcW w:type="dxa" w:w="2448"/>
+            <w:vAlign w:val="center"/>
+            <w:shd w:fill="F3F3F3"/>
             <w:tcMar>
-              <w:top w:w="90" w:type="dxa"/>
-              <w:bottom w:w="90" w:type="dxa"/>
-              <w:left w:w="90" w:type="dxa"/>
-              <w:right w:w="90" w:type="dxa"/>
+              <w:top w:w="95" w:type="dxa"/>
+              <w:bottom w:w="95" w:type="dxa"/>
+              <w:left w:w="95" w:type="dxa"/>
+              <w:right w:w="95" w:type="dxa"/>
             </w:tcMar>
           </w:tcPr>
           <w:p>
             <w:pPr>
-              <w:spacing w:after="40" w:before="40"/>
+              <w:spacing w:before="40" w:after="40" w:line="245" w:lineRule="auto"/>
+              <w:jc w:val="left"/>
             </w:pPr>
             <w:r>
               <w:rPr>
                 <w:b w:val="0"/>
                 <w:color w:val="000000"/>
-                <w:sz w:val="20"/>
+                <w:sz w:val="21"/>
               </w:rPr>
-              <w:t>CartContext</w:t>
+              <w:t>Estado del carrito</w:t>
             </w:r>
           </w:p>
         </w:tc>
         <w:tc>
           <w:tcPr>
-            <w:tcW w:type="dxa" w:w="2376"/>
-            <w:shd w:fill="F2F2F2"/>
+            <w:tcW w:type="dxa" w:w="2592"/>
+            <w:vAlign w:val="center"/>
+            <w:shd w:fill="F3F3F3"/>
             <w:tcMar>
-              <w:top w:w="90" w:type="dxa"/>
-              <w:bottom w:w="90" w:type="dxa"/>
-              <w:left w:w="90" w:type="dxa"/>
-              <w:right w:w="90" w:type="dxa"/>
+              <w:top w:w="95" w:type="dxa"/>
+              <w:bottom w:w="95" w:type="dxa"/>
+              <w:left w:w="95" w:type="dxa"/>
+              <w:right w:w="95" w:type="dxa"/>
             </w:tcMar>
           </w:tcPr>
           <w:p>
             <w:pPr>
-              <w:spacing w:after="40" w:before="40"/>
+              <w:spacing w:before="40" w:after="40" w:line="245" w:lineRule="auto"/>
+              <w:jc w:val="center"/>
             </w:pPr>
             <w:r>
               <w:rPr>
                 <w:b w:val="0"/>
                 <w:color w:val="000000"/>
-                <w:sz w:val="20"/>
+                <w:sz w:val="21"/>
               </w:rPr>
-              <w:t>84,61% de ramas</w:t>
+              <w:t>84,61%</w:t>
             </w:r>
           </w:p>
         </w:tc>
         <w:tc>
           <w:tcPr>
-            <w:tcW w:type="dxa" w:w="5256"/>
-            <w:shd w:fill="F2F2F2"/>
+            <w:tcW w:type="dxa" w:w="5040"/>
+            <w:vAlign w:val="center"/>
+            <w:shd w:fill="F3F3F3"/>
             <w:tcMar>
-              <w:top w:w="90" w:type="dxa"/>
-              <w:bottom w:w="90" w:type="dxa"/>
-              <w:left w:w="90" w:type="dxa"/>
-              <w:right w:w="90" w:type="dxa"/>
+              <w:top w:w="95" w:type="dxa"/>
+              <w:bottom w:w="95" w:type="dxa"/>
+              <w:left w:w="95" w:type="dxa"/>
+              <w:right w:w="95" w:type="dxa"/>
             </w:tcMar>
           </w:tcPr>
           <w:p>
             <w:pPr>
-              <w:spacing w:after="40" w:before="40"/>
+              <w:spacing w:before="40" w:after="40" w:line="245" w:lineRule="auto"/>
+              <w:jc w:val="left"/>
             </w:pPr>
             <w:r>
               <w:rPr>
                 <w:b w:val="0"/>
                 <w:color w:val="000000"/>
-                <w:sz w:val="20"/>
+                <w:sz w:val="21"/>
               </w:rPr>
-              <w:t>Se prueban datos dañados y límites; no todas las variantes de decisiones.</w:t>
+              <w:t>Variantes de decisión sobre datos y recuperación.</w:t>
             </w:r>
           </w:p>
         </w:tc>
@@ -2428,169 +2524,103 @@
         </w:trPr>
         <w:tc>
           <w:tcPr>
-            <w:tcW w:type="dxa" w:w="2160"/>
+            <w:tcW w:type="dxa" w:w="2448"/>
+            <w:vAlign w:val="center"/>
             <w:shd w:fill="FFFFFF"/>
             <w:tcMar>
-              <w:top w:w="90" w:type="dxa"/>
-              <w:bottom w:w="90" w:type="dxa"/>
-              <w:left w:w="90" w:type="dxa"/>
-              <w:right w:w="90" w:type="dxa"/>
+              <w:top w:w="95" w:type="dxa"/>
+              <w:bottom w:w="95" w:type="dxa"/>
+              <w:left w:w="95" w:type="dxa"/>
+              <w:right w:w="95" w:type="dxa"/>
             </w:tcMar>
           </w:tcPr>
           <w:p>
             <w:pPr>
-              <w:spacing w:after="40" w:before="40"/>
+              <w:spacing w:before="40" w:after="40" w:line="245" w:lineRule="auto"/>
+              <w:jc w:val="left"/>
             </w:pPr>
             <w:r>
               <w:rPr>
                 <w:b w:val="0"/>
                 <w:color w:val="000000"/>
-                <w:sz w:val="20"/>
+                <w:sz w:val="21"/>
               </w:rPr>
-              <w:t>RoutineBuilder</w:t>
+              <w:t>Construcción de rutina</w:t>
             </w:r>
           </w:p>
         </w:tc>
         <w:tc>
           <w:tcPr>
-            <w:tcW w:type="dxa" w:w="2376"/>
+            <w:tcW w:type="dxa" w:w="2592"/>
+            <w:vAlign w:val="center"/>
             <w:shd w:fill="FFFFFF"/>
             <w:tcMar>
-              <w:top w:w="90" w:type="dxa"/>
-              <w:bottom w:w="90" w:type="dxa"/>
-              <w:left w:w="90" w:type="dxa"/>
-              <w:right w:w="90" w:type="dxa"/>
+              <w:top w:w="95" w:type="dxa"/>
+              <w:bottom w:w="95" w:type="dxa"/>
+              <w:left w:w="95" w:type="dxa"/>
+              <w:right w:w="95" w:type="dxa"/>
             </w:tcMar>
           </w:tcPr>
           <w:p>
             <w:pPr>
-              <w:spacing w:after="40" w:before="40"/>
+              <w:spacing w:before="40" w:after="40" w:line="245" w:lineRule="auto"/>
+              <w:jc w:val="center"/>
             </w:pPr>
             <w:r>
               <w:rPr>
                 <w:b w:val="0"/>
                 <w:color w:val="000000"/>
-                <w:sz w:val="20"/>
+                <w:sz w:val="21"/>
               </w:rPr>
-              <w:t>78,94% de ramas</w:t>
+              <w:t>78,94%</w:t>
             </w:r>
           </w:p>
         </w:tc>
         <w:tc>
           <w:tcPr>
-            <w:tcW w:type="dxa" w:w="5256"/>
+            <w:tcW w:type="dxa" w:w="5040"/>
+            <w:vAlign w:val="center"/>
             <w:shd w:fill="FFFFFF"/>
             <w:tcMar>
-              <w:top w:w="90" w:type="dxa"/>
-              <w:bottom w:w="90" w:type="dxa"/>
-              <w:left w:w="90" w:type="dxa"/>
-              <w:right w:w="90" w:type="dxa"/>
+              <w:top w:w="95" w:type="dxa"/>
+              <w:bottom w:w="95" w:type="dxa"/>
+              <w:left w:w="95" w:type="dxa"/>
+              <w:right w:w="95" w:type="dxa"/>
             </w:tcMar>
           </w:tcPr>
           <w:p>
             <w:pPr>
-              <w:spacing w:after="40" w:before="40"/>
+              <w:spacing w:before="40" w:after="40" w:line="245" w:lineRule="auto"/>
+              <w:jc w:val="left"/>
             </w:pPr>
             <w:r>
               <w:rPr>
                 <w:b w:val="0"/>
                 <w:color w:val="000000"/>
-                <w:sz w:val="20"/>
+                <w:sz w:val="21"/>
               </w:rPr>
-              <w:t>Persistencia probada; quedan variantes de recuperación en la interfaz.</w:t>
-            </w:r>
-          </w:p>
-        </w:tc>
-      </w:tr>
-      <w:tr>
-        <w:trPr>
-          <w:cantSplit/>
-        </w:trPr>
-        <w:tc>
-          <w:tcPr>
-            <w:tcW w:type="dxa" w:w="2160"/>
-            <w:shd w:fill="F2F2F2"/>
-            <w:tcMar>
-              <w:top w:w="90" w:type="dxa"/>
-              <w:bottom w:w="90" w:type="dxa"/>
-              <w:left w:w="90" w:type="dxa"/>
-              <w:right w:w="90" w:type="dxa"/>
-            </w:tcMar>
-          </w:tcPr>
-          <w:p>
-            <w:pPr>
-              <w:spacing w:after="40" w:before="40"/>
-            </w:pPr>
-            <w:r>
-              <w:rPr>
-                <w:b w:val="0"/>
-                <w:color w:val="000000"/>
-                <w:sz w:val="20"/>
-              </w:rPr>
-              <w:t>AdminLayout y useCart</w:t>
-            </w:r>
-          </w:p>
-        </w:tc>
-        <w:tc>
-          <w:tcPr>
-            <w:tcW w:type="dxa" w:w="2376"/>
-            <w:shd w:fill="F2F2F2"/>
-            <w:tcMar>
-              <w:top w:w="90" w:type="dxa"/>
-              <w:bottom w:w="90" w:type="dxa"/>
-              <w:left w:w="90" w:type="dxa"/>
-              <w:right w:w="90" w:type="dxa"/>
-            </w:tcMar>
-          </w:tcPr>
-          <w:p>
-            <w:pPr>
-              <w:spacing w:after="40" w:before="40"/>
-            </w:pPr>
-            <w:r>
-              <w:rPr>
-                <w:b w:val="0"/>
-                <w:color w:val="000000"/>
-                <w:sz w:val="20"/>
-              </w:rPr>
-              <w:t>76,92% y 75% de líneas</w:t>
-            </w:r>
-          </w:p>
-        </w:tc>
-        <w:tc>
-          <w:tcPr>
-            <w:tcW w:type="dxa" w:w="5256"/>
-            <w:shd w:fill="F2F2F2"/>
-            <w:tcMar>
-              <w:top w:w="90" w:type="dxa"/>
-              <w:bottom w:w="90" w:type="dxa"/>
-              <w:left w:w="90" w:type="dxa"/>
-              <w:right w:w="90" w:type="dxa"/>
-            </w:tcMar>
-          </w:tcPr>
-          <w:p>
-            <w:pPr>
-              <w:spacing w:after="40" w:before="40"/>
-            </w:pPr>
-            <w:r>
-              <w:rPr>
-                <w:b w:val="0"/>
-                <w:color w:val="000000"/>
-                <w:sz w:val="20"/>
-              </w:rPr>
-              <w:t>Callbacks y uso fuera del proveedor no están totalmente ejecutados.</w:t>
+              <w:t>Alternativas de error y recuperación en la interfaz.</w:t>
             </w:r>
           </w:p>
         </w:tc>
       </w:tr>
     </w:tbl>
     <w:p>
+      <w:pPr>
+        <w:spacing w:after="40" w:before="0" w:line="40" w:lineRule="exact"/>
+      </w:pPr>
       <w:r>
-        <w:t>No se añadieron pruebas que solo repitan la implementación para elevar porcentajes. Ante cambios en estas zonas conviene seleccionar escenarios de comportamiento que reproduzcan un riesgo real, incluidos límites exactos y recuperación de fallos.</w:t>
+        <w:rPr>
+          <w:sz w:val="4"/>
+        </w:rPr>
       </w:r>
     </w:p>
     <w:p>
+      <w:pPr>
+        <w:widowControl/>
+      </w:pPr>
       <w:r>
-        <w:br w:type="page"/>
+        <w:t>Las próximas ampliaciones de pruebas deberán priorizar escenarios observables y límites de negocio. El aumento de un porcentaje, por sí solo, no demuestra una mejora de calidad.</w:t>
       </w:r>
     </w:p>
     <w:p>
@@ -2598,144 +2628,37 @@
         <w:pStyle w:val="Heading1"/>
       </w:pPr>
       <w:r>
-        <w:t>Límites de la evidencia y reproducción</w:t>
+        <w:t>Exclusiones y aceptación pendiente</w:t>
       </w:r>
     </w:p>
     <w:p>
       <w:pPr>
-        <w:pStyle w:val="Heading1"/>
+        <w:widowControl/>
       </w:pPr>
       <w:r>
-        <w:t>Alcance y exclusiones</w:t>
-      </w:r>
-    </w:p>
-    <w:p>
-      <w:r>
-        <w:t>V8 instrumenta src/**/*.{js,jsx}; se excluyen main.jsx, src/test y los archivos de pruebas. CSS, HTML/JS heredado, rendimiento real, servicios de terceros y requisitos no implementados no quedan acreditados por estos porcentajes. Los 597 casos incluyen pruebas unitarias y de integración; no se presentan como 597 pruebas unitarias aisladas.</w:t>
-      </w:r>
-    </w:p>
-    <w:p>
-      <w:r>
-        <w:t>El iframe y el enlace directo conservan el video original. YouTube mostró que el video está restringido y requiere aprobación, con código 151, tanto dentro del iframe como en su página. La reproducción no pudo validarse en este entorno y debe comprobarse en el navegador de presentación. Esta observación no demuestra un fallo del componente React.</w:t>
-      </w:r>
-    </w:p>
-    <w:p>
-      <w:r>
-        <w:t>RNF-01 y RNF-02 conservan objetivos de 3 segundos y 300 milisegundos, sin una medición específica que los acredite. RNF-12 requiere comprobar Chrome, Edge, Firefox y Safari; el navegador integrado no sustituye esa matriz. Los casos de etiquetas, teclado y foco tampoco constituyen una auditoría exhaustiva de accesibilidad.</w:t>
-      </w:r>
-    </w:p>
-    <w:p>
-      <w:r>
-        <w:t>El sistema mantiene el alcance académico: sesión y datos en LocalStorage, contacto con validación local, pedidos demostrativos y aviso de checkout sin pago ni creación de pedidos. Las guardas del cliente no reemplazan autorización en servidor para una futura versión productiva.</w:t>
+        <w:t>La instrumentación excluye el punto de arranque, los auxiliares de prueba y las propias pruebas. La medición no acredita estilos, contenido heredado, servicios externos, rendimiento real ni comportamiento en todos los navegadores. El entorno simulado tampoco reproduce íntegramente el diseño visual o las tecnologías de asistencia.</w:t>
       </w:r>
     </w:p>
     <w:p>
       <w:pPr>
-        <w:pStyle w:val="Heading1"/>
+        <w:widowControl/>
       </w:pPr>
       <w:r>
-        <w:t>Reproducir desde GitHub</w:t>
+        <w:t>Continúan pendientes la matriz Chrome, Edge, Firefox y Safari, las mediciones de carga de 3 segundos y respuesta inferior a 300 milisegundos, y la reproducción del video externo, cuyo proveedor mostró restricción con código 151.</w:t>
       </w:r>
     </w:p>
     <w:p>
       <w:pPr>
-        <w:spacing w:after="80"/>
+        <w:widowControl/>
       </w:pPr>
       <w:r>
-        <w:rPr>
-          <w:rFonts w:ascii="Consolas" w:hAnsi="Consolas"/>
-          <w:sz w:val="18"/>
-        </w:rPr>
-        <w:t>git clone --branch feature/react-migration --single-branch https://github.com/AlexanderLlanten/Fs2_pROYECTO.git</w:t>
-      </w:r>
-    </w:p>
-    <w:p>
-      <w:pPr>
-        <w:spacing w:after="80"/>
-      </w:pPr>
-      <w:r>
-        <w:rPr>
-          <w:rFonts w:ascii="Consolas" w:hAnsi="Consolas"/>
-          <w:sz w:val="18"/>
-        </w:rPr>
-        <w:t>cd Fs2_pROYECTO</w:t>
-      </w:r>
-    </w:p>
-    <w:p>
-      <w:pPr>
-        <w:spacing w:after="80"/>
-      </w:pPr>
-      <w:r>
-        <w:rPr>
-          <w:rFonts w:ascii="Consolas" w:hAnsi="Consolas"/>
-          <w:sz w:val="18"/>
-        </w:rPr>
-        <w:t>npm.cmd ci</w:t>
-      </w:r>
-    </w:p>
-    <w:p>
-      <w:pPr>
-        <w:spacing w:after="80"/>
-      </w:pPr>
-      <w:r>
-        <w:rPr>
-          <w:rFonts w:ascii="Consolas" w:hAnsi="Consolas"/>
-          <w:sz w:val="18"/>
-        </w:rPr>
-        <w:t>npm.cmd run test:coverage</w:t>
-      </w:r>
-    </w:p>
-    <w:p>
-      <w:pPr>
-        <w:spacing w:after="80"/>
-      </w:pPr>
-      <w:r>
-        <w:rPr>
-          <w:rFonts w:ascii="Consolas" w:hAnsi="Consolas"/>
-          <w:sz w:val="18"/>
-        </w:rPr>
-        <w:t>npm.cmd run build</w:t>
-      </w:r>
-    </w:p>
-    <w:p>
-      <w:pPr>
-        <w:spacing w:after="80"/>
-      </w:pPr>
-      <w:r>
-        <w:rPr>
-          <w:rFonts w:ascii="Consolas" w:hAnsi="Consolas"/>
-          <w:sz w:val="18"/>
-        </w:rPr>
-        <w:t>npm.cmd run preview</w:t>
-      </w:r>
-    </w:p>
-    <w:p>
-      <w:r>
-        <w:t>Desde el ZIP, extraer el proyecto, abrir una terminal en la carpeta que contiene package.json y ejecutar los cuatro últimos comandos. Node 24.22.1 fue la versión comprobada. Usar la URL que imprima Vite y mantener el mismo host y puerto para conservar los datos locales de esa sesión de prueba.</w:t>
-      </w:r>
-    </w:p>
-    <w:p>
-      <w:pPr>
-        <w:pStyle w:val="Heading1"/>
-      </w:pPr>
-      <w:r>
-        <w:t>Fuentes y entregables relacionados</w:t>
-      </w:r>
-    </w:p>
-    <w:p>
-      <w:r>
-        <w:t>Pauta DSY1104 Evaluación Parcial 2 EE EP Estudiante, páginas 3–4 y 6–9; ERS KYNEX 2.1; vite.config.js; package-lock.json; archivos citados en los casos. Los resultados y nombres de los 597 casos están en docs/evidencias/testing-final.json y el detalle de cobertura en docs/evidencias/coverage-summary.json. El HTML se regenera en coverage/index.html.</w:t>
-      </w:r>
-    </w:p>
-    <w:p>
-      <w:r>
-        <w:t>docs/auditoria-final.md conserva los recorridos y sus límites; docs/guia-defensa.md prepara la exposición de diez casos. Repositorio público: https://github.com/AlexanderLlanten/Fs2_pROYECTO/tree/feature/react-migration. La evaluación de la exposición individual corresponde al docente.</w:t>
+        <w:t>La versión presenta resultados satisfactorios dentro del alcance académico Front End y de los escenarios evaluados. Su aceptación integral queda condicionada a completar las comprobaciones anteriores. La operación productiva requerirá servicios de servidor y controles adicionales de seguridad y persistencia.</w:t>
       </w:r>
     </w:p>
     <w:sectPr>
       <w:footerReference w:type="default" r:id="rId9"/>
-      <w:pgSz w:w="11952" w:h="16848"/>
-      <w:pgMar w:top="1008" w:right="1080" w:bottom="936" w:left="1080" w:header="720" w:footer="720" w:gutter="0"/>
+      <w:pgSz w:w="12240" w:h="15840"/>
+      <w:pgMar w:top="936" w:right="1080" w:bottom="936" w:left="1080" w:header="720" w:footer="432" w:gutter="0"/>
       <w:cols w:space="720"/>
       <w:docGrid w:linePitch="360"/>
     </w:sectPr>
@@ -2750,7 +2673,12 @@
       <w:pStyle w:val="Footer"/>
       <w:jc w:val="right"/>
     </w:pPr>
-    <w:r/>
+    <w:r>
+      <w:rPr>
+        <w:sz w:val="18"/>
+      </w:rPr>
+      <w:t xml:space="preserve">KYNEX · </w:t>
+    </w:r>
     <w:fldSimple w:instr="PAGE"/>
   </w:p>
 </w:ftr>
@@ -3120,7 +3048,7 @@
     <w:qFormat/>
     <w:rsid w:val="00FC693F"/>
     <w:pPr>
-      <w:spacing w:after="140" w:line="254" w:lineRule="auto"/>
+      <w:spacing w:line="254" w:lineRule="auto" w:after="140"/>
     </w:pPr>
     <w:rPr>
       <w:rFonts w:ascii="Calibri" w:hAnsi="Calibri"/>
@@ -3183,7 +3111,7 @@
     <w:pPr>
       <w:keepNext/>
       <w:keepLines/>
-      <w:spacing w:before="480" w:after="0"/>
+      <w:spacing w:before="480" w:after="200"/>
       <w:outlineLvl w:val="0"/>
     </w:pPr>
     <w:rPr>

</xml_diff>

<commit_message>
docs: registra retiro del legado y reemplazos React
</commit_message>
<xml_diff>
--- a/docs/entrega/Cobertura_Testing_KYNEX.docx
+++ b/docs/entrega/Cobertura_Testing_KYNEX.docx
@@ -2636,7 +2636,7 @@
         <w:widowControl/>
       </w:pPr>
       <w:r>
-        <w:t>La instrumentación excluye el punto de arranque, los auxiliares de prueba y las propias pruebas. La medición no acredita estilos, contenido heredado, servicios externos, rendimiento real ni comportamiento en todos los navegadores. El entorno simulado tampoco reproduce íntegramente el diseño visual o las tecnologías de asistencia.</w:t>
+        <w:t>La instrumentación excluye el punto de arranque, los auxiliares de prueba y las propias pruebas. La medición no acredita estilos, servicios externos, rendimiento real ni comportamiento en todos los navegadores. El entorno simulado tampoco reproduce íntegramente el diseño visual o las tecnologías de asistencia.</w:t>
       </w:r>
     </w:p>
     <w:p>
@@ -2653,6 +2653,421 @@
       </w:pPr>
       <w:r>
         <w:t>La versión presenta resultados satisfactorios dentro del alcance académico Front End y de los escenarios evaluados. Su aceptación integral queda condicionada a completar las comprobaciones anteriores. La operación productiva requerirá servicios de servidor y controles adicionales de seguridad y persistencia.</w:t>
+      </w:r>
+    </w:p>
+    <w:p>
+      <w:pPr>
+        <w:pStyle w:val="Heading1"/>
+        <w:pageBreakBefore/>
+      </w:pPr>
+      <w:r>
+        <w:t>Verificación tras la depuración</w:t>
+      </w:r>
+    </w:p>
+    <w:p>
+      <w:r>
+        <w:t>La eliminación de 51 archivos antiguos se verificó mediante revisión de dependencias, regresión automatizada y comparación de la compilación. Las responsabilidades retiradas ya están cubiertas por la implementación React vigente.</w:t>
+      </w:r>
+    </w:p>
+    <w:tbl>
+      <w:tblPr>
+        <w:tblW w:type="auto" w:w="0"/>
+        <w:tblLayout w:type="fixed"/>
+        <w:tblLook w:firstColumn="1" w:firstRow="1" w:lastColumn="0" w:lastRow="0" w:noHBand="0" w:noVBand="1" w:val="04A0"/>
+        <w:tblBorders>
+          <w:top w:val="single" w:sz="4" w:color="D9D9D9"/>
+          <w:left w:val="single" w:sz="4" w:color="D9D9D9"/>
+          <w:bottom w:val="single" w:sz="4" w:color="D9D9D9"/>
+          <w:right w:val="single" w:sz="4" w:color="D9D9D9"/>
+          <w:insideH w:val="single" w:sz="4" w:color="D9D9D9"/>
+          <w:insideV w:val="single" w:sz="4" w:color="D9D9D9"/>
+        </w:tblBorders>
+      </w:tblPr>
+      <w:tblGrid>
+        <w:gridCol w:w="2376"/>
+        <w:gridCol w:w="1080"/>
+        <w:gridCol w:w="6624"/>
+      </w:tblGrid>
+      <w:tr>
+        <w:trPr>
+          <w:cantSplit/>
+          <w:tblHeader/>
+        </w:trPr>
+        <w:tc>
+          <w:tcPr>
+            <w:tcW w:type="dxa" w:w="2376"/>
+            <w:vAlign w:val="center"/>
+            <w:shd w:fill="333333"/>
+            <w:tcMar>
+              <w:top w:w="95" w:type="dxa"/>
+              <w:bottom w:w="95" w:type="dxa"/>
+              <w:left w:w="95" w:type="dxa"/>
+              <w:right w:w="95" w:type="dxa"/>
+            </w:tcMar>
+          </w:tcPr>
+          <w:p>
+            <w:pPr>
+              <w:spacing w:before="40" w:after="40" w:line="245" w:lineRule="auto"/>
+            </w:pPr>
+            <w:r>
+              <w:rPr>
+                <w:b/>
+                <w:color w:val="FFFFFF"/>
+                <w:sz w:val="21"/>
+              </w:rPr>
+              <w:t>Elemento retirado</w:t>
+            </w:r>
+          </w:p>
+        </w:tc>
+        <w:tc>
+          <w:tcPr>
+            <w:tcW w:type="dxa" w:w="1080"/>
+            <w:vAlign w:val="center"/>
+            <w:shd w:fill="333333"/>
+            <w:tcMar>
+              <w:top w:w="95" w:type="dxa"/>
+              <w:bottom w:w="95" w:type="dxa"/>
+              <w:left w:w="95" w:type="dxa"/>
+              <w:right w:w="95" w:type="dxa"/>
+            </w:tcMar>
+          </w:tcPr>
+          <w:p>
+            <w:pPr>
+              <w:spacing w:before="40" w:after="40" w:line="245" w:lineRule="auto"/>
+              <w:jc w:val="center"/>
+            </w:pPr>
+            <w:r>
+              <w:rPr>
+                <w:b/>
+                <w:color w:val="FFFFFF"/>
+                <w:sz w:val="21"/>
+              </w:rPr>
+              <w:t>Cantidad</w:t>
+            </w:r>
+          </w:p>
+        </w:tc>
+        <w:tc>
+          <w:tcPr>
+            <w:tcW w:type="dxa" w:w="6624"/>
+            <w:vAlign w:val="center"/>
+            <w:shd w:fill="333333"/>
+            <w:tcMar>
+              <w:top w:w="95" w:type="dxa"/>
+              <w:bottom w:w="95" w:type="dxa"/>
+              <w:left w:w="95" w:type="dxa"/>
+              <w:right w:w="95" w:type="dxa"/>
+            </w:tcMar>
+          </w:tcPr>
+          <w:p>
+            <w:pPr>
+              <w:spacing w:before="40" w:after="40" w:line="245" w:lineRule="auto"/>
+            </w:pPr>
+            <w:r>
+              <w:rPr>
+                <w:b/>
+                <w:color w:val="FFFFFF"/>
+                <w:sz w:val="21"/>
+              </w:rPr>
+              <w:t>Reemplazo vigente</w:t>
+            </w:r>
+          </w:p>
+        </w:tc>
+      </w:tr>
+      <w:tr>
+        <w:trPr>
+          <w:cantSplit/>
+        </w:trPr>
+        <w:tc>
+          <w:tcPr>
+            <w:tcW w:type="dxa" w:w="2376"/>
+            <w:vAlign w:val="center"/>
+            <w:shd w:fill="FFFFFF"/>
+            <w:tcMar>
+              <w:top w:w="95" w:type="dxa"/>
+              <w:bottom w:w="95" w:type="dxa"/>
+              <w:left w:w="95" w:type="dxa"/>
+              <w:right w:w="95" w:type="dxa"/>
+            </w:tcMar>
+          </w:tcPr>
+          <w:p>
+            <w:pPr>
+              <w:spacing w:before="40" w:after="40" w:line="245" w:lineRule="auto"/>
+            </w:pPr>
+            <w:r>
+              <w:rPr>
+                <w:b w:val="0"/>
+                <w:color w:val="000000"/>
+                <w:sz w:val="21"/>
+              </w:rPr>
+              <w:t>Pantallas HTML</w:t>
+            </w:r>
+          </w:p>
+        </w:tc>
+        <w:tc>
+          <w:tcPr>
+            <w:tcW w:type="dxa" w:w="1080"/>
+            <w:vAlign w:val="center"/>
+            <w:shd w:fill="FFFFFF"/>
+            <w:tcMar>
+              <w:top w:w="95" w:type="dxa"/>
+              <w:bottom w:w="95" w:type="dxa"/>
+              <w:left w:w="95" w:type="dxa"/>
+              <w:right w:w="95" w:type="dxa"/>
+            </w:tcMar>
+          </w:tcPr>
+          <w:p>
+            <w:pPr>
+              <w:spacing w:before="40" w:after="40" w:line="245" w:lineRule="auto"/>
+              <w:jc w:val="center"/>
+            </w:pPr>
+            <w:r>
+              <w:rPr>
+                <w:b w:val="0"/>
+                <w:color w:val="000000"/>
+                <w:sz w:val="21"/>
+              </w:rPr>
+              <w:t>19</w:t>
+            </w:r>
+          </w:p>
+        </w:tc>
+        <w:tc>
+          <w:tcPr>
+            <w:tcW w:type="dxa" w:w="6624"/>
+            <w:vAlign w:val="center"/>
+            <w:shd w:fill="FFFFFF"/>
+            <w:tcMar>
+              <w:top w:w="95" w:type="dxa"/>
+              <w:bottom w:w="95" w:type="dxa"/>
+              <w:left w:w="95" w:type="dxa"/>
+              <w:right w:w="95" w:type="dxa"/>
+            </w:tcMar>
+          </w:tcPr>
+          <w:p>
+            <w:pPr>
+              <w:spacing w:before="40" w:after="40" w:line="245" w:lineRule="auto"/>
+            </w:pPr>
+            <w:r>
+              <w:rPr>
+                <w:b w:val="0"/>
+                <w:color w:val="000000"/>
+                <w:sz w:val="21"/>
+              </w:rPr>
+              <w:t>Páginas React y navegación con React Router; plantillas públicas y administrativas compartidas.</w:t>
+            </w:r>
+          </w:p>
+        </w:tc>
+      </w:tr>
+      <w:tr>
+        <w:trPr>
+          <w:cantSplit/>
+        </w:trPr>
+        <w:tc>
+          <w:tcPr>
+            <w:tcW w:type="dxa" w:w="2376"/>
+            <w:vAlign w:val="center"/>
+            <w:shd w:fill="F3F3F3"/>
+            <w:tcMar>
+              <w:top w:w="95" w:type="dxa"/>
+              <w:bottom w:w="95" w:type="dxa"/>
+              <w:left w:w="95" w:type="dxa"/>
+              <w:right w:w="95" w:type="dxa"/>
+            </w:tcMar>
+          </w:tcPr>
+          <w:p>
+            <w:pPr>
+              <w:spacing w:before="40" w:after="40" w:line="245" w:lineRule="auto"/>
+            </w:pPr>
+            <w:r>
+              <w:rPr>
+                <w:b w:val="0"/>
+                <w:color w:val="000000"/>
+                <w:sz w:val="21"/>
+              </w:rPr>
+              <w:t>Hojas de estilo CSS</w:t>
+            </w:r>
+          </w:p>
+        </w:tc>
+        <w:tc>
+          <w:tcPr>
+            <w:tcW w:type="dxa" w:w="1080"/>
+            <w:vAlign w:val="center"/>
+            <w:shd w:fill="F3F3F3"/>
+            <w:tcMar>
+              <w:top w:w="95" w:type="dxa"/>
+              <w:bottom w:w="95" w:type="dxa"/>
+              <w:left w:w="95" w:type="dxa"/>
+              <w:right w:w="95" w:type="dxa"/>
+            </w:tcMar>
+          </w:tcPr>
+          <w:p>
+            <w:pPr>
+              <w:spacing w:before="40" w:after="40" w:line="245" w:lineRule="auto"/>
+              <w:jc w:val="center"/>
+            </w:pPr>
+            <w:r>
+              <w:rPr>
+                <w:b w:val="0"/>
+                <w:color w:val="000000"/>
+                <w:sz w:val="21"/>
+              </w:rPr>
+              <w:t>7</w:t>
+            </w:r>
+          </w:p>
+        </w:tc>
+        <w:tc>
+          <w:tcPr>
+            <w:tcW w:type="dxa" w:w="6624"/>
+            <w:vAlign w:val="center"/>
+            <w:shd w:fill="F3F3F3"/>
+            <w:tcMar>
+              <w:top w:w="95" w:type="dxa"/>
+              <w:bottom w:w="95" w:type="dxa"/>
+              <w:left w:w="95" w:type="dxa"/>
+              <w:right w:w="95" w:type="dxa"/>
+            </w:tcMar>
+          </w:tcPr>
+          <w:p>
+            <w:pPr>
+              <w:spacing w:before="40" w:after="40" w:line="245" w:lineRule="auto"/>
+            </w:pPr>
+            <w:r>
+              <w:rPr>
+                <w:b w:val="0"/>
+                <w:color w:val="000000"/>
+                <w:sz w:val="21"/>
+              </w:rPr>
+              <w:t>Estilos de la aplicación React y Bootstrap, manteniendo la identidad visual KYNEX.</w:t>
+            </w:r>
+          </w:p>
+        </w:tc>
+      </w:tr>
+      <w:tr>
+        <w:trPr>
+          <w:cantSplit/>
+        </w:trPr>
+        <w:tc>
+          <w:tcPr>
+            <w:tcW w:type="dxa" w:w="2376"/>
+            <w:vAlign w:val="center"/>
+            <w:shd w:fill="FFFFFF"/>
+            <w:tcMar>
+              <w:top w:w="95" w:type="dxa"/>
+              <w:bottom w:w="95" w:type="dxa"/>
+              <w:left w:w="95" w:type="dxa"/>
+              <w:right w:w="95" w:type="dxa"/>
+            </w:tcMar>
+          </w:tcPr>
+          <w:p>
+            <w:pPr>
+              <w:spacing w:before="40" w:after="40" w:line="245" w:lineRule="auto"/>
+            </w:pPr>
+            <w:r>
+              <w:rPr>
+                <w:b w:val="0"/>
+                <w:color w:val="000000"/>
+                <w:sz w:val="21"/>
+              </w:rPr>
+              <w:t>Módulos JavaScript</w:t>
+            </w:r>
+          </w:p>
+        </w:tc>
+        <w:tc>
+          <w:tcPr>
+            <w:tcW w:type="dxa" w:w="1080"/>
+            <w:vAlign w:val="center"/>
+            <w:shd w:fill="FFFFFF"/>
+            <w:tcMar>
+              <w:top w:w="95" w:type="dxa"/>
+              <w:bottom w:w="95" w:type="dxa"/>
+              <w:left w:w="95" w:type="dxa"/>
+              <w:right w:w="95" w:type="dxa"/>
+            </w:tcMar>
+          </w:tcPr>
+          <w:p>
+            <w:pPr>
+              <w:spacing w:before="40" w:after="40" w:line="245" w:lineRule="auto"/>
+              <w:jc w:val="center"/>
+            </w:pPr>
+            <w:r>
+              <w:rPr>
+                <w:b w:val="0"/>
+                <w:color w:val="000000"/>
+                <w:sz w:val="21"/>
+              </w:rPr>
+              <w:t>25</w:t>
+            </w:r>
+          </w:p>
+        </w:tc>
+        <w:tc>
+          <w:tcPr>
+            <w:tcW w:type="dxa" w:w="6624"/>
+            <w:vAlign w:val="center"/>
+            <w:shd w:fill="FFFFFF"/>
+            <w:tcMar>
+              <w:top w:w="95" w:type="dxa"/>
+              <w:bottom w:w="95" w:type="dxa"/>
+              <w:left w:w="95" w:type="dxa"/>
+              <w:right w:w="95" w:type="dxa"/>
+            </w:tcMar>
+          </w:tcPr>
+          <w:p>
+            <w:pPr>
+              <w:spacing w:before="40" w:after="40" w:line="245" w:lineRule="auto"/>
+            </w:pPr>
+            <w:r>
+              <w:rPr>
+                <w:b w:val="0"/>
+                <w:color w:val="000000"/>
+                <w:sz w:val="21"/>
+              </w:rPr>
+              <w:t>Componentes, estado compartido, hooks, servicios, validaciones y datos del catálogo React.</w:t>
+            </w:r>
+          </w:p>
+        </w:tc>
+      </w:tr>
+    </w:tbl>
+    <w:p>
+      <w:pPr>
+        <w:pStyle w:val="Heading2"/>
+      </w:pPr>
+      <w:r>
+        <w:t>Preservación de la prueba del catálogo</w:t>
+      </w:r>
+    </w:p>
+    <w:p>
+      <w:r>
+        <w:t>Una prueba todavía dependía del módulo antiguo de productos. Sus seis registros completos se conservaron como una referencia histórica independiente, exclusiva de testing. La prueba compara todos los campos con el catálogo vigente sin utilizar código de la implementación retirada.</w:t>
+      </w:r>
+    </w:p>
+    <w:p>
+      <w:pPr>
+        <w:pStyle w:val="Heading2"/>
+      </w:pPr>
+      <w:r>
+        <w:t>Resultados posteriores al retiro</w:t>
+      </w:r>
+    </w:p>
+    <w:p>
+      <w:r>
+        <w:t>La regresión aprobó 597 pruebas distribuidas en 80 agrupaciones, sin fallos ni omisiones, en 109,92 segundos. La cobertura se mantiene en 97,91% de sentencias, 94,74% de ramas, 99,30% de funciones y 98,98% de líneas. Los archivos retirados no pertenecían al código instrumentado de la aplicación React.</w:t>
+      </w:r>
+    </w:p>
+    <w:p>
+      <w:r>
+        <w:t>La compilación finalizó correctamente. Sus 24 archivos coinciden byte a byte con la salida previa a la limpieza. También se verificó la conservación de las 19 imágenes y la ausencia de dependencias hacia los módulos eliminados.</w:t>
+      </w:r>
+    </w:p>
+    <w:p>
+      <w:pPr>
+        <w:pStyle w:val="Heading2"/>
+      </w:pPr>
+      <w:r>
+        <w:t>Alcance de la evidencia</w:t>
+      </w:r>
+    </w:p>
+    <w:p>
+      <w:r>
+        <w:t>La revisión visual anterior corresponde al mismo resultado compilado; la comparación no constituye una nueva evaluación de navegador. Permanecen las condiciones pendientes de rendimiento, compatibilidad y reproducción multimedia. El historial Git conserva la implementación retirada.</w:t>
       </w:r>
     </w:p>
     <w:sectPr>

</xml_diff>